<commit_message>
Enseñando a juan y karen
</commit_message>
<xml_diff>
--- a/Historias de Usuario.docx
+++ b/Historias de Usuario.docx
@@ -113,14 +113,16 @@
               </w:rPr>
               <w:t xml:space="preserve"> </w:t>
             </w:r>
-            <w:r>
-              <w:rPr>
-                <w:rFonts w:ascii="Times New Roman" w:eastAsia="Times New Roman" w:hAnsi="Times New Roman" w:cs="Times New Roman"/>
-                <w:sz w:val="24"/>
-                <w:szCs w:val="24"/>
-              </w:rPr>
-              <w:t>1</w:t>
-            </w:r>
+            <w:proofErr w:type="spellStart"/>
+            <w:r>
+              <w:rPr>
+                <w:rFonts w:ascii="Times New Roman" w:eastAsia="Times New Roman" w:hAnsi="Times New Roman" w:cs="Times New Roman"/>
+                <w:sz w:val="24"/>
+                <w:szCs w:val="24"/>
+              </w:rPr>
+              <w:t>xd</w:t>
+            </w:r>
+            <w:proofErr w:type="spellEnd"/>
           </w:p>
         </w:tc>
       </w:tr>

</xml_diff>

<commit_message>
Cambios en historias de usuario
</commit_message>
<xml_diff>
--- a/Historias de Usuario.docx
+++ b/Historias de Usuario.docx
@@ -421,23 +421,21 @@
                 <w:szCs w:val="24"/>
               </w:rPr>
             </w:pPr>
-            <w:proofErr w:type="spellStart"/>
-            <w:r>
-              <w:rPr>
-                <w:rFonts w:ascii="Times New Roman" w:eastAsia="Times New Roman" w:hAnsi="Times New Roman" w:cs="Times New Roman"/>
-                <w:sz w:val="24"/>
-                <w:szCs w:val="24"/>
-              </w:rPr>
-              <w:t>loguear</w:t>
-            </w:r>
-            <w:proofErr w:type="spellEnd"/>
-            <w:r>
-              <w:rPr>
-                <w:rFonts w:ascii="Times New Roman" w:eastAsia="Times New Roman" w:hAnsi="Times New Roman" w:cs="Times New Roman"/>
-                <w:sz w:val="24"/>
-                <w:szCs w:val="24"/>
-              </w:rPr>
-              <w:t xml:space="preserve"> e iniciar sesión con mi cuenta de usuario.</w:t>
+            <w:r>
+              <w:rPr>
+                <w:rFonts w:ascii="Times New Roman" w:eastAsia="Times New Roman" w:hAnsi="Times New Roman" w:cs="Times New Roman"/>
+                <w:sz w:val="24"/>
+                <w:szCs w:val="24"/>
+              </w:rPr>
+              <w:t>I</w:t>
+            </w:r>
+            <w:r>
+              <w:rPr>
+                <w:rFonts w:ascii="Times New Roman" w:eastAsia="Times New Roman" w:hAnsi="Times New Roman" w:cs="Times New Roman"/>
+                <w:sz w:val="24"/>
+                <w:szCs w:val="24"/>
+              </w:rPr>
+              <w:t>niciar sesión con mi cuenta de usuario.</w:t>
             </w:r>
           </w:p>
           <w:p>
@@ -1466,23 +1464,21 @@
                 <w:szCs w:val="24"/>
               </w:rPr>
             </w:pPr>
-            <w:proofErr w:type="spellStart"/>
-            <w:r>
-              <w:rPr>
-                <w:rFonts w:ascii="Times New Roman" w:eastAsia="Times New Roman" w:hAnsi="Times New Roman" w:cs="Times New Roman"/>
-                <w:sz w:val="24"/>
-                <w:szCs w:val="24"/>
-              </w:rPr>
-              <w:t>loguear</w:t>
-            </w:r>
-            <w:proofErr w:type="spellEnd"/>
-            <w:r>
-              <w:rPr>
-                <w:rFonts w:ascii="Times New Roman" w:eastAsia="Times New Roman" w:hAnsi="Times New Roman" w:cs="Times New Roman"/>
-                <w:sz w:val="24"/>
-                <w:szCs w:val="24"/>
-              </w:rPr>
-              <w:t xml:space="preserve"> e iniciar sesión con mi cuenta de usuario.</w:t>
+            <w:r>
+              <w:rPr>
+                <w:rFonts w:ascii="Times New Roman" w:eastAsia="Times New Roman" w:hAnsi="Times New Roman" w:cs="Times New Roman"/>
+                <w:sz w:val="24"/>
+                <w:szCs w:val="24"/>
+              </w:rPr>
+              <w:t>I</w:t>
+            </w:r>
+            <w:r>
+              <w:rPr>
+                <w:rFonts w:ascii="Times New Roman" w:eastAsia="Times New Roman" w:hAnsi="Times New Roman" w:cs="Times New Roman"/>
+                <w:sz w:val="24"/>
+                <w:szCs w:val="24"/>
+              </w:rPr>
+              <w:t>niciar sesión con mi cuenta de usuario.</w:t>
             </w:r>
           </w:p>
         </w:tc>
@@ -2469,7 +2465,7 @@
                 <w:sz w:val="24"/>
                 <w:szCs w:val="24"/>
               </w:rPr>
-              <w:t xml:space="preserve">Poder recuperar mi contraseña si se me olvido. </w:t>
+              <w:t>Poder recuperar mi contraseña</w:t>
             </w:r>
           </w:p>
         </w:tc>
@@ -3748,6 +3744,16 @@
           </w:tcPr>
           <w:p>
             <w:pPr>
+              <w:spacing w:line="240" w:lineRule="auto"/>
+              <w:rPr>
+                <w:rFonts w:ascii="Times New Roman" w:eastAsia="Times New Roman" w:hAnsi="Times New Roman" w:cs="Times New Roman"/>
+                <w:sz w:val="24"/>
+                <w:szCs w:val="24"/>
+              </w:rPr>
+            </w:pPr>
+          </w:p>
+          <w:p>
+            <w:pPr>
               <w:numPr>
                 <w:ilvl w:val="0"/>
                 <w:numId w:val="5"/>
@@ -3765,7 +3771,7 @@
                 <w:sz w:val="24"/>
                 <w:szCs w:val="24"/>
               </w:rPr>
-              <w:t>Mostrar mesas y horarios disponibles</w:t>
+              <w:t>Mostrar restaurantes en su área.</w:t>
             </w:r>
           </w:p>
           <w:p>
@@ -3787,7 +3793,7 @@
                 <w:sz w:val="24"/>
                 <w:szCs w:val="24"/>
               </w:rPr>
-              <w:t>Mostrar restaurantes en su área.</w:t>
+              <w:t>Seleccionar restaurante.</w:t>
             </w:r>
           </w:p>
           <w:p>
@@ -3809,7 +3815,31 @@
                 <w:sz w:val="24"/>
                 <w:szCs w:val="24"/>
               </w:rPr>
-              <w:t>Seleccionar restaurante.</w:t>
+              <w:t>Mostrar mesas</w:t>
+            </w:r>
+            <w:r>
+              <w:rPr>
+                <w:rFonts w:ascii="Times New Roman" w:eastAsia="Times New Roman" w:hAnsi="Times New Roman" w:cs="Times New Roman"/>
+                <w:sz w:val="24"/>
+                <w:szCs w:val="24"/>
+              </w:rPr>
+              <w:t>,</w:t>
+            </w:r>
+            <w:r>
+              <w:rPr>
+                <w:rFonts w:ascii="Times New Roman" w:eastAsia="Times New Roman" w:hAnsi="Times New Roman" w:cs="Times New Roman"/>
+                <w:sz w:val="24"/>
+                <w:szCs w:val="24"/>
+              </w:rPr>
+              <w:t xml:space="preserve"> horarios</w:t>
+            </w:r>
+            <w:r>
+              <w:rPr>
+                <w:rFonts w:ascii="Times New Roman" w:eastAsia="Times New Roman" w:hAnsi="Times New Roman" w:cs="Times New Roman"/>
+                <w:sz w:val="24"/>
+                <w:szCs w:val="24"/>
+              </w:rPr>
+              <w:t xml:space="preserve"> y platillos disponibles</w:t>
             </w:r>
           </w:p>
           <w:p>
@@ -3831,7 +3861,31 @@
                 <w:sz w:val="24"/>
                 <w:szCs w:val="24"/>
               </w:rPr>
-              <w:t>Seleccionar mesa y hora</w:t>
+              <w:t>Seleccionar mesa</w:t>
+            </w:r>
+            <w:r>
+              <w:rPr>
+                <w:rFonts w:ascii="Times New Roman" w:eastAsia="Times New Roman" w:hAnsi="Times New Roman" w:cs="Times New Roman"/>
+                <w:sz w:val="24"/>
+                <w:szCs w:val="24"/>
+              </w:rPr>
+              <w:t>,</w:t>
+            </w:r>
+            <w:r>
+              <w:rPr>
+                <w:rFonts w:ascii="Times New Roman" w:eastAsia="Times New Roman" w:hAnsi="Times New Roman" w:cs="Times New Roman"/>
+                <w:sz w:val="24"/>
+                <w:szCs w:val="24"/>
+              </w:rPr>
+              <w:t xml:space="preserve"> hora</w:t>
+            </w:r>
+            <w:r>
+              <w:rPr>
+                <w:rFonts w:ascii="Times New Roman" w:eastAsia="Times New Roman" w:hAnsi="Times New Roman" w:cs="Times New Roman"/>
+                <w:sz w:val="24"/>
+                <w:szCs w:val="24"/>
+              </w:rPr>
+              <w:t xml:space="preserve"> y platillos</w:t>
             </w:r>
           </w:p>
           <w:p>
@@ -4078,535 +4132,18 @@
               </w:rPr>
               <w:t xml:space="preserve">2 </w:t>
             </w:r>
-            <w:proofErr w:type="spellStart"/>
-            <w:r>
-              <w:rPr>
-                <w:rFonts w:ascii="Times New Roman" w:eastAsia="Times New Roman" w:hAnsi="Times New Roman" w:cs="Times New Roman"/>
-                <w:sz w:val="24"/>
-                <w:szCs w:val="24"/>
-              </w:rPr>
-              <w:t>Dias</w:t>
-            </w:r>
-            <w:proofErr w:type="spellEnd"/>
+            <w:r>
+              <w:rPr>
+                <w:rFonts w:ascii="Times New Roman" w:eastAsia="Times New Roman" w:hAnsi="Times New Roman" w:cs="Times New Roman"/>
+                <w:sz w:val="24"/>
+                <w:szCs w:val="24"/>
+              </w:rPr>
+              <w:t>días</w:t>
+            </w:r>
           </w:p>
         </w:tc>
       </w:tr>
     </w:tbl>
-    <w:p>
-      <w:pPr>
-        <w:spacing w:line="240" w:lineRule="auto"/>
-        <w:ind w:left="1200"/>
-        <w:rPr>
-          <w:rFonts w:ascii="Times New Roman" w:eastAsia="Times New Roman" w:hAnsi="Times New Roman" w:cs="Times New Roman"/>
-          <w:sz w:val="24"/>
-          <w:szCs w:val="24"/>
-        </w:rPr>
-      </w:pPr>
-    </w:p>
-    <w:p>
-      <w:pPr>
-        <w:spacing w:line="240" w:lineRule="auto"/>
-        <w:ind w:left="1200"/>
-        <w:rPr>
-          <w:rFonts w:ascii="Times New Roman" w:eastAsia="Times New Roman" w:hAnsi="Times New Roman" w:cs="Times New Roman"/>
-          <w:sz w:val="20"/>
-          <w:szCs w:val="20"/>
-        </w:rPr>
-      </w:pPr>
-    </w:p>
-    <w:p>
-      <w:pPr>
-        <w:spacing w:line="240" w:lineRule="auto"/>
-        <w:ind w:left="1200"/>
-        <w:rPr>
-          <w:rFonts w:ascii="Times New Roman" w:eastAsia="Times New Roman" w:hAnsi="Times New Roman" w:cs="Times New Roman"/>
-          <w:sz w:val="20"/>
-          <w:szCs w:val="20"/>
-        </w:rPr>
-      </w:pPr>
-    </w:p>
-    <w:p>
-      <w:pPr>
-        <w:spacing w:line="240" w:lineRule="auto"/>
-        <w:ind w:left="1200"/>
-        <w:rPr>
-          <w:rFonts w:ascii="Times New Roman" w:eastAsia="Times New Roman" w:hAnsi="Times New Roman" w:cs="Times New Roman"/>
-          <w:sz w:val="20"/>
-          <w:szCs w:val="20"/>
-        </w:rPr>
-      </w:pPr>
-    </w:p>
-    <w:p>
-      <w:pPr>
-        <w:spacing w:line="240" w:lineRule="auto"/>
-        <w:ind w:left="1200"/>
-        <w:rPr>
-          <w:rFonts w:ascii="Times New Roman" w:eastAsia="Times New Roman" w:hAnsi="Times New Roman" w:cs="Times New Roman"/>
-          <w:sz w:val="20"/>
-          <w:szCs w:val="20"/>
-        </w:rPr>
-      </w:pPr>
-    </w:p>
-    <w:p>
-      <w:pPr>
-        <w:spacing w:line="240" w:lineRule="auto"/>
-        <w:ind w:left="1200"/>
-        <w:rPr>
-          <w:rFonts w:ascii="Times New Roman" w:eastAsia="Times New Roman" w:hAnsi="Times New Roman" w:cs="Times New Roman"/>
-          <w:sz w:val="20"/>
-          <w:szCs w:val="20"/>
-        </w:rPr>
-      </w:pPr>
-    </w:p>
-    <w:p>
-      <w:pPr>
-        <w:spacing w:line="240" w:lineRule="auto"/>
-        <w:ind w:left="1200"/>
-        <w:rPr>
-          <w:rFonts w:ascii="Times New Roman" w:eastAsia="Times New Roman" w:hAnsi="Times New Roman" w:cs="Times New Roman"/>
-          <w:sz w:val="20"/>
-          <w:szCs w:val="20"/>
-        </w:rPr>
-      </w:pPr>
-    </w:p>
-    <w:p>
-      <w:pPr>
-        <w:spacing w:line="240" w:lineRule="auto"/>
-        <w:ind w:left="1200"/>
-        <w:rPr>
-          <w:rFonts w:ascii="Times New Roman" w:eastAsia="Times New Roman" w:hAnsi="Times New Roman" w:cs="Times New Roman"/>
-          <w:sz w:val="20"/>
-          <w:szCs w:val="20"/>
-        </w:rPr>
-      </w:pPr>
-    </w:p>
-    <w:p>
-      <w:pPr>
-        <w:spacing w:line="240" w:lineRule="auto"/>
-        <w:ind w:left="1200"/>
-        <w:rPr>
-          <w:rFonts w:ascii="Times New Roman" w:eastAsia="Times New Roman" w:hAnsi="Times New Roman" w:cs="Times New Roman"/>
-          <w:sz w:val="20"/>
-          <w:szCs w:val="20"/>
-        </w:rPr>
-      </w:pPr>
-    </w:p>
-    <w:p>
-      <w:pPr>
-        <w:spacing w:line="240" w:lineRule="auto"/>
-        <w:ind w:left="1200"/>
-        <w:rPr>
-          <w:rFonts w:ascii="Times New Roman" w:eastAsia="Times New Roman" w:hAnsi="Times New Roman" w:cs="Times New Roman"/>
-          <w:sz w:val="20"/>
-          <w:szCs w:val="20"/>
-        </w:rPr>
-      </w:pPr>
-    </w:p>
-    <w:p>
-      <w:pPr>
-        <w:spacing w:line="240" w:lineRule="auto"/>
-        <w:ind w:left="1200"/>
-        <w:rPr>
-          <w:rFonts w:ascii="Times New Roman" w:eastAsia="Times New Roman" w:hAnsi="Times New Roman" w:cs="Times New Roman"/>
-          <w:sz w:val="20"/>
-          <w:szCs w:val="20"/>
-        </w:rPr>
-      </w:pPr>
-    </w:p>
-    <w:p>
-      <w:pPr>
-        <w:spacing w:line="240" w:lineRule="auto"/>
-        <w:ind w:left="1200"/>
-        <w:rPr>
-          <w:rFonts w:ascii="Times New Roman" w:eastAsia="Times New Roman" w:hAnsi="Times New Roman" w:cs="Times New Roman"/>
-          <w:sz w:val="20"/>
-          <w:szCs w:val="20"/>
-        </w:rPr>
-      </w:pPr>
-    </w:p>
-    <w:p>
-      <w:pPr>
-        <w:spacing w:line="240" w:lineRule="auto"/>
-        <w:ind w:left="1200"/>
-        <w:rPr>
-          <w:rFonts w:ascii="Times New Roman" w:eastAsia="Times New Roman" w:hAnsi="Times New Roman" w:cs="Times New Roman"/>
-          <w:sz w:val="20"/>
-          <w:szCs w:val="20"/>
-        </w:rPr>
-      </w:pPr>
-    </w:p>
-    <w:p>
-      <w:pPr>
-        <w:spacing w:line="240" w:lineRule="auto"/>
-        <w:ind w:left="1200"/>
-        <w:rPr>
-          <w:rFonts w:ascii="Times New Roman" w:eastAsia="Times New Roman" w:hAnsi="Times New Roman" w:cs="Times New Roman"/>
-          <w:sz w:val="20"/>
-          <w:szCs w:val="20"/>
-        </w:rPr>
-      </w:pPr>
-    </w:p>
-    <w:p>
-      <w:pPr>
-        <w:spacing w:line="240" w:lineRule="auto"/>
-        <w:ind w:left="1200"/>
-        <w:rPr>
-          <w:rFonts w:ascii="Times New Roman" w:eastAsia="Times New Roman" w:hAnsi="Times New Roman" w:cs="Times New Roman"/>
-          <w:sz w:val="20"/>
-          <w:szCs w:val="20"/>
-        </w:rPr>
-      </w:pPr>
-    </w:p>
-    <w:p>
-      <w:pPr>
-        <w:spacing w:line="240" w:lineRule="auto"/>
-        <w:rPr>
-          <w:rFonts w:ascii="Times New Roman" w:eastAsia="Times New Roman" w:hAnsi="Times New Roman" w:cs="Times New Roman"/>
-          <w:sz w:val="24"/>
-          <w:szCs w:val="24"/>
-        </w:rPr>
-      </w:pPr>
-    </w:p>
-    <w:p>
-      <w:pPr>
-        <w:spacing w:line="240" w:lineRule="auto"/>
-        <w:rPr>
-          <w:rFonts w:ascii="Times New Roman" w:eastAsia="Times New Roman" w:hAnsi="Times New Roman" w:cs="Times New Roman"/>
-          <w:sz w:val="24"/>
-          <w:szCs w:val="24"/>
-        </w:rPr>
-      </w:pPr>
-    </w:p>
-    <w:p>
-      <w:pPr>
-        <w:spacing w:line="240" w:lineRule="auto"/>
-        <w:rPr>
-          <w:rFonts w:ascii="Times New Roman" w:eastAsia="Times New Roman" w:hAnsi="Times New Roman" w:cs="Times New Roman"/>
-          <w:sz w:val="24"/>
-          <w:szCs w:val="24"/>
-        </w:rPr>
-      </w:pPr>
-    </w:p>
-    <w:p>
-      <w:pPr>
-        <w:spacing w:line="240" w:lineRule="auto"/>
-        <w:rPr>
-          <w:rFonts w:ascii="Times New Roman" w:eastAsia="Times New Roman" w:hAnsi="Times New Roman" w:cs="Times New Roman"/>
-          <w:sz w:val="24"/>
-          <w:szCs w:val="24"/>
-        </w:rPr>
-      </w:pPr>
-    </w:p>
-    <w:p>
-      <w:pPr>
-        <w:spacing w:line="240" w:lineRule="auto"/>
-        <w:rPr>
-          <w:rFonts w:ascii="Times New Roman" w:eastAsia="Times New Roman" w:hAnsi="Times New Roman" w:cs="Times New Roman"/>
-          <w:sz w:val="24"/>
-          <w:szCs w:val="24"/>
-        </w:rPr>
-      </w:pPr>
-    </w:p>
-    <w:p>
-      <w:pPr>
-        <w:spacing w:line="240" w:lineRule="auto"/>
-        <w:rPr>
-          <w:rFonts w:ascii="Times New Roman" w:eastAsia="Times New Roman" w:hAnsi="Times New Roman" w:cs="Times New Roman"/>
-          <w:sz w:val="24"/>
-          <w:szCs w:val="24"/>
-        </w:rPr>
-      </w:pPr>
-    </w:p>
-    <w:p>
-      <w:pPr>
-        <w:spacing w:line="240" w:lineRule="auto"/>
-        <w:rPr>
-          <w:rFonts w:ascii="Times New Roman" w:eastAsia="Times New Roman" w:hAnsi="Times New Roman" w:cs="Times New Roman"/>
-          <w:sz w:val="24"/>
-          <w:szCs w:val="24"/>
-        </w:rPr>
-      </w:pPr>
-    </w:p>
-    <w:p>
-      <w:pPr>
-        <w:spacing w:line="240" w:lineRule="auto"/>
-        <w:rPr>
-          <w:rFonts w:ascii="Times New Roman" w:eastAsia="Times New Roman" w:hAnsi="Times New Roman" w:cs="Times New Roman"/>
-          <w:sz w:val="24"/>
-          <w:szCs w:val="24"/>
-        </w:rPr>
-      </w:pPr>
-    </w:p>
-    <w:p>
-      <w:pPr>
-        <w:spacing w:line="240" w:lineRule="auto"/>
-        <w:rPr>
-          <w:rFonts w:ascii="Times New Roman" w:eastAsia="Times New Roman" w:hAnsi="Times New Roman" w:cs="Times New Roman"/>
-          <w:sz w:val="24"/>
-          <w:szCs w:val="24"/>
-        </w:rPr>
-      </w:pPr>
-    </w:p>
-    <w:p>
-      <w:pPr>
-        <w:spacing w:line="240" w:lineRule="auto"/>
-        <w:rPr>
-          <w:rFonts w:ascii="Times New Roman" w:eastAsia="Times New Roman" w:hAnsi="Times New Roman" w:cs="Times New Roman"/>
-          <w:sz w:val="24"/>
-          <w:szCs w:val="24"/>
-        </w:rPr>
-      </w:pPr>
-    </w:p>
-    <w:p>
-      <w:pPr>
-        <w:spacing w:line="240" w:lineRule="auto"/>
-        <w:rPr>
-          <w:rFonts w:ascii="Times New Roman" w:eastAsia="Times New Roman" w:hAnsi="Times New Roman" w:cs="Times New Roman"/>
-          <w:sz w:val="24"/>
-          <w:szCs w:val="24"/>
-        </w:rPr>
-      </w:pPr>
-    </w:p>
-    <w:p>
-      <w:pPr>
-        <w:spacing w:line="240" w:lineRule="auto"/>
-        <w:rPr>
-          <w:rFonts w:ascii="Times New Roman" w:eastAsia="Times New Roman" w:hAnsi="Times New Roman" w:cs="Times New Roman"/>
-          <w:sz w:val="24"/>
-          <w:szCs w:val="24"/>
-        </w:rPr>
-      </w:pPr>
-    </w:p>
-    <w:p>
-      <w:pPr>
-        <w:spacing w:line="240" w:lineRule="auto"/>
-        <w:rPr>
-          <w:rFonts w:ascii="Times New Roman" w:eastAsia="Times New Roman" w:hAnsi="Times New Roman" w:cs="Times New Roman"/>
-          <w:sz w:val="24"/>
-          <w:szCs w:val="24"/>
-        </w:rPr>
-      </w:pPr>
-    </w:p>
-    <w:p>
-      <w:pPr>
-        <w:spacing w:line="240" w:lineRule="auto"/>
-        <w:rPr>
-          <w:rFonts w:ascii="Times New Roman" w:eastAsia="Times New Roman" w:hAnsi="Times New Roman" w:cs="Times New Roman"/>
-          <w:sz w:val="24"/>
-          <w:szCs w:val="24"/>
-        </w:rPr>
-      </w:pPr>
-    </w:p>
-    <w:p>
-      <w:pPr>
-        <w:spacing w:line="240" w:lineRule="auto"/>
-        <w:rPr>
-          <w:rFonts w:ascii="Times New Roman" w:eastAsia="Times New Roman" w:hAnsi="Times New Roman" w:cs="Times New Roman"/>
-          <w:sz w:val="24"/>
-          <w:szCs w:val="24"/>
-        </w:rPr>
-      </w:pPr>
-    </w:p>
-    <w:p>
-      <w:pPr>
-        <w:spacing w:line="240" w:lineRule="auto"/>
-        <w:rPr>
-          <w:rFonts w:ascii="Times New Roman" w:eastAsia="Times New Roman" w:hAnsi="Times New Roman" w:cs="Times New Roman"/>
-          <w:sz w:val="24"/>
-          <w:szCs w:val="24"/>
-        </w:rPr>
-      </w:pPr>
-    </w:p>
-    <w:p>
-      <w:pPr>
-        <w:spacing w:line="240" w:lineRule="auto"/>
-        <w:rPr>
-          <w:rFonts w:ascii="Times New Roman" w:eastAsia="Times New Roman" w:hAnsi="Times New Roman" w:cs="Times New Roman"/>
-          <w:sz w:val="24"/>
-          <w:szCs w:val="24"/>
-        </w:rPr>
-      </w:pPr>
-    </w:p>
-    <w:p>
-      <w:pPr>
-        <w:spacing w:line="240" w:lineRule="auto"/>
-        <w:rPr>
-          <w:rFonts w:ascii="Times New Roman" w:eastAsia="Times New Roman" w:hAnsi="Times New Roman" w:cs="Times New Roman"/>
-          <w:sz w:val="24"/>
-          <w:szCs w:val="24"/>
-        </w:rPr>
-      </w:pPr>
-    </w:p>
-    <w:p>
-      <w:pPr>
-        <w:spacing w:line="240" w:lineRule="auto"/>
-        <w:rPr>
-          <w:rFonts w:ascii="Times New Roman" w:eastAsia="Times New Roman" w:hAnsi="Times New Roman" w:cs="Times New Roman"/>
-          <w:sz w:val="24"/>
-          <w:szCs w:val="24"/>
-        </w:rPr>
-      </w:pPr>
-    </w:p>
-    <w:p>
-      <w:pPr>
-        <w:spacing w:line="240" w:lineRule="auto"/>
-        <w:rPr>
-          <w:rFonts w:ascii="Times New Roman" w:eastAsia="Times New Roman" w:hAnsi="Times New Roman" w:cs="Times New Roman"/>
-          <w:sz w:val="24"/>
-          <w:szCs w:val="24"/>
-        </w:rPr>
-      </w:pPr>
-    </w:p>
-    <w:p>
-      <w:pPr>
-        <w:spacing w:line="240" w:lineRule="auto"/>
-        <w:rPr>
-          <w:rFonts w:ascii="Times New Roman" w:eastAsia="Times New Roman" w:hAnsi="Times New Roman" w:cs="Times New Roman"/>
-          <w:sz w:val="24"/>
-          <w:szCs w:val="24"/>
-        </w:rPr>
-      </w:pPr>
-    </w:p>
-    <w:p>
-      <w:pPr>
-        <w:spacing w:line="240" w:lineRule="auto"/>
-        <w:rPr>
-          <w:rFonts w:ascii="Times New Roman" w:eastAsia="Times New Roman" w:hAnsi="Times New Roman" w:cs="Times New Roman"/>
-          <w:sz w:val="24"/>
-          <w:szCs w:val="24"/>
-        </w:rPr>
-      </w:pPr>
-    </w:p>
-    <w:p>
-      <w:pPr>
-        <w:spacing w:line="240" w:lineRule="auto"/>
-        <w:rPr>
-          <w:rFonts w:ascii="Times New Roman" w:eastAsia="Times New Roman" w:hAnsi="Times New Roman" w:cs="Times New Roman"/>
-          <w:sz w:val="24"/>
-          <w:szCs w:val="24"/>
-        </w:rPr>
-      </w:pPr>
-    </w:p>
-    <w:p>
-      <w:pPr>
-        <w:spacing w:line="240" w:lineRule="auto"/>
-        <w:rPr>
-          <w:rFonts w:ascii="Times New Roman" w:eastAsia="Times New Roman" w:hAnsi="Times New Roman" w:cs="Times New Roman"/>
-          <w:sz w:val="24"/>
-          <w:szCs w:val="24"/>
-        </w:rPr>
-      </w:pPr>
-    </w:p>
-    <w:p>
-      <w:pPr>
-        <w:spacing w:line="240" w:lineRule="auto"/>
-        <w:rPr>
-          <w:rFonts w:ascii="Times New Roman" w:eastAsia="Times New Roman" w:hAnsi="Times New Roman" w:cs="Times New Roman"/>
-          <w:sz w:val="24"/>
-          <w:szCs w:val="24"/>
-        </w:rPr>
-      </w:pPr>
-    </w:p>
-    <w:p>
-      <w:pPr>
-        <w:spacing w:line="240" w:lineRule="auto"/>
-        <w:rPr>
-          <w:rFonts w:ascii="Times New Roman" w:eastAsia="Times New Roman" w:hAnsi="Times New Roman" w:cs="Times New Roman"/>
-          <w:sz w:val="24"/>
-          <w:szCs w:val="24"/>
-        </w:rPr>
-      </w:pPr>
-    </w:p>
-    <w:p>
-      <w:pPr>
-        <w:spacing w:line="240" w:lineRule="auto"/>
-        <w:rPr>
-          <w:rFonts w:ascii="Times New Roman" w:eastAsia="Times New Roman" w:hAnsi="Times New Roman" w:cs="Times New Roman"/>
-          <w:sz w:val="24"/>
-          <w:szCs w:val="24"/>
-        </w:rPr>
-      </w:pPr>
-    </w:p>
-    <w:p>
-      <w:pPr>
-        <w:spacing w:line="240" w:lineRule="auto"/>
-        <w:rPr>
-          <w:rFonts w:ascii="Times New Roman" w:eastAsia="Times New Roman" w:hAnsi="Times New Roman" w:cs="Times New Roman"/>
-          <w:sz w:val="24"/>
-          <w:szCs w:val="24"/>
-        </w:rPr>
-      </w:pPr>
-    </w:p>
-    <w:p>
-      <w:pPr>
-        <w:spacing w:line="240" w:lineRule="auto"/>
-        <w:rPr>
-          <w:rFonts w:ascii="Times New Roman" w:eastAsia="Times New Roman" w:hAnsi="Times New Roman" w:cs="Times New Roman"/>
-          <w:sz w:val="24"/>
-          <w:szCs w:val="24"/>
-        </w:rPr>
-      </w:pPr>
-    </w:p>
-    <w:p>
-      <w:pPr>
-        <w:spacing w:line="240" w:lineRule="auto"/>
-        <w:rPr>
-          <w:rFonts w:ascii="Times New Roman" w:eastAsia="Times New Roman" w:hAnsi="Times New Roman" w:cs="Times New Roman"/>
-          <w:sz w:val="24"/>
-          <w:szCs w:val="24"/>
-        </w:rPr>
-      </w:pPr>
-    </w:p>
-    <w:p>
-      <w:pPr>
-        <w:spacing w:line="240" w:lineRule="auto"/>
-        <w:rPr>
-          <w:rFonts w:ascii="Times New Roman" w:eastAsia="Times New Roman" w:hAnsi="Times New Roman" w:cs="Times New Roman"/>
-          <w:sz w:val="24"/>
-          <w:szCs w:val="24"/>
-        </w:rPr>
-      </w:pPr>
-    </w:p>
-    <w:p>
-      <w:pPr>
-        <w:spacing w:line="240" w:lineRule="auto"/>
-        <w:rPr>
-          <w:rFonts w:ascii="Times New Roman" w:eastAsia="Times New Roman" w:hAnsi="Times New Roman" w:cs="Times New Roman"/>
-          <w:sz w:val="24"/>
-          <w:szCs w:val="24"/>
-        </w:rPr>
-      </w:pPr>
-    </w:p>
-    <w:p>
-      <w:pPr>
-        <w:spacing w:line="240" w:lineRule="auto"/>
-        <w:rPr>
-          <w:rFonts w:ascii="Times New Roman" w:eastAsia="Times New Roman" w:hAnsi="Times New Roman" w:cs="Times New Roman"/>
-          <w:sz w:val="24"/>
-          <w:szCs w:val="24"/>
-        </w:rPr>
-      </w:pPr>
-    </w:p>
-    <w:p>
-      <w:pPr>
-        <w:spacing w:line="240" w:lineRule="auto"/>
-        <w:rPr>
-          <w:rFonts w:ascii="Times New Roman" w:eastAsia="Times New Roman" w:hAnsi="Times New Roman" w:cs="Times New Roman"/>
-          <w:sz w:val="24"/>
-          <w:szCs w:val="24"/>
-        </w:rPr>
-      </w:pPr>
-    </w:p>
-    <w:p>
-      <w:pPr>
-        <w:spacing w:line="240" w:lineRule="auto"/>
-        <w:rPr>
-          <w:rFonts w:ascii="Times New Roman" w:eastAsia="Times New Roman" w:hAnsi="Times New Roman" w:cs="Times New Roman"/>
-          <w:sz w:val="24"/>
-          <w:szCs w:val="24"/>
-        </w:rPr>
-      </w:pPr>
-    </w:p>
     <w:p>
       <w:pPr>
         <w:spacing w:line="240" w:lineRule="auto"/>
@@ -4620,7 +4157,7 @@
     <w:tbl>
       <w:tblPr>
         <w:tblStyle w:val="a3"/>
-        <w:tblpPr w:leftFromText="180" w:rightFromText="180" w:topFromText="180" w:bottomFromText="180" w:vertAnchor="text"/>
+        <w:tblpPr w:leftFromText="180" w:rightFromText="180" w:topFromText="180" w:bottomFromText="180" w:vertAnchor="text" w:tblpY="131"/>
         <w:tblW w:w="8644" w:type="dxa"/>
         <w:tblInd w:w="0" w:type="dxa"/>
         <w:tblLayout w:type="fixed"/>
@@ -4933,7 +4470,15 @@
                 <w:sz w:val="24"/>
                 <w:szCs w:val="24"/>
               </w:rPr>
-              <w:t>ajustar mi reserva</w:t>
+              <w:t>Modificar</w:t>
+            </w:r>
+            <w:r>
+              <w:rPr>
+                <w:rFonts w:ascii="Times New Roman" w:eastAsia="Times New Roman" w:hAnsi="Times New Roman" w:cs="Times New Roman"/>
+                <w:sz w:val="24"/>
+                <w:szCs w:val="24"/>
+              </w:rPr>
+              <w:t xml:space="preserve"> mi reserva</w:t>
             </w:r>
           </w:p>
         </w:tc>
@@ -5010,7 +4555,7 @@
                 <w:sz w:val="24"/>
                 <w:szCs w:val="24"/>
               </w:rPr>
-              <w:t>tenerla de forma que me convenga</w:t>
+              <w:t>Realizar cambios en mi reserva</w:t>
             </w:r>
           </w:p>
         </w:tc>
@@ -5180,23 +4725,45 @@
               </w:rPr>
               <w:t xml:space="preserve">Modificar hora, </w:t>
             </w:r>
-            <w:proofErr w:type="spellStart"/>
-            <w:r>
-              <w:rPr>
-                <w:rFonts w:ascii="Times New Roman" w:eastAsia="Times New Roman" w:hAnsi="Times New Roman" w:cs="Times New Roman"/>
-                <w:sz w:val="24"/>
-                <w:szCs w:val="24"/>
-              </w:rPr>
-              <w:t>dia</w:t>
-            </w:r>
-            <w:proofErr w:type="spellEnd"/>
-            <w:r>
-              <w:rPr>
-                <w:rFonts w:ascii="Times New Roman" w:eastAsia="Times New Roman" w:hAnsi="Times New Roman" w:cs="Times New Roman"/>
-                <w:sz w:val="24"/>
-                <w:szCs w:val="24"/>
-              </w:rPr>
-              <w:t xml:space="preserve">, mesa y platos </w:t>
+            <w:r>
+              <w:rPr>
+                <w:rFonts w:ascii="Times New Roman" w:eastAsia="Times New Roman" w:hAnsi="Times New Roman" w:cs="Times New Roman"/>
+                <w:sz w:val="24"/>
+                <w:szCs w:val="24"/>
+              </w:rPr>
+              <w:t>fecha</w:t>
+            </w:r>
+            <w:r>
+              <w:rPr>
+                <w:rFonts w:ascii="Times New Roman" w:eastAsia="Times New Roman" w:hAnsi="Times New Roman" w:cs="Times New Roman"/>
+                <w:sz w:val="24"/>
+                <w:szCs w:val="24"/>
+              </w:rPr>
+              <w:t xml:space="preserve">, mesa </w:t>
+            </w:r>
+            <w:r>
+              <w:rPr>
+                <w:rFonts w:ascii="Times New Roman" w:eastAsia="Times New Roman" w:hAnsi="Times New Roman" w:cs="Times New Roman"/>
+                <w:sz w:val="24"/>
+                <w:szCs w:val="24"/>
+              </w:rPr>
+              <w:t>y</w:t>
+            </w:r>
+            <w:r>
+              <w:rPr>
+                <w:rFonts w:ascii="Times New Roman" w:eastAsia="Times New Roman" w:hAnsi="Times New Roman" w:cs="Times New Roman"/>
+                <w:sz w:val="24"/>
+                <w:szCs w:val="24"/>
+              </w:rPr>
+              <w:t xml:space="preserve"> plat</w:t>
+            </w:r>
+            <w:r>
+              <w:rPr>
+                <w:rFonts w:ascii="Times New Roman" w:eastAsia="Times New Roman" w:hAnsi="Times New Roman" w:cs="Times New Roman"/>
+                <w:sz w:val="24"/>
+                <w:szCs w:val="24"/>
+              </w:rPr>
+              <w:t>illos</w:t>
             </w:r>
           </w:p>
           <w:p>
@@ -5443,16 +5010,14 @@
               </w:rPr>
               <w:t xml:space="preserve">12 </w:t>
             </w:r>
-            <w:proofErr w:type="gramStart"/>
-            <w:r>
-              <w:rPr>
-                <w:rFonts w:ascii="Times New Roman" w:eastAsia="Times New Roman" w:hAnsi="Times New Roman" w:cs="Times New Roman"/>
-                <w:sz w:val="24"/>
-                <w:szCs w:val="24"/>
-              </w:rPr>
-              <w:t>Horas</w:t>
-            </w:r>
-            <w:proofErr w:type="gramEnd"/>
+            <w:r>
+              <w:rPr>
+                <w:rFonts w:ascii="Times New Roman" w:eastAsia="Times New Roman" w:hAnsi="Times New Roman" w:cs="Times New Roman"/>
+                <w:sz w:val="24"/>
+                <w:szCs w:val="24"/>
+              </w:rPr>
+              <w:t>horas</w:t>
+            </w:r>
           </w:p>
         </w:tc>
       </w:tr>
@@ -5460,7 +5025,6 @@
     <w:p>
       <w:pPr>
         <w:spacing w:line="240" w:lineRule="auto"/>
-        <w:ind w:left="1200"/>
         <w:rPr>
           <w:rFonts w:ascii="Times New Roman" w:eastAsia="Times New Roman" w:hAnsi="Times New Roman" w:cs="Times New Roman"/>
           <w:sz w:val="24"/>
@@ -5471,6 +5035,26 @@
     <w:p>
       <w:pPr>
         <w:spacing w:line="240" w:lineRule="auto"/>
+        <w:rPr>
+          <w:rFonts w:ascii="Times New Roman" w:eastAsia="Times New Roman" w:hAnsi="Times New Roman" w:cs="Times New Roman"/>
+          <w:sz w:val="24"/>
+          <w:szCs w:val="24"/>
+        </w:rPr>
+      </w:pPr>
+    </w:p>
+    <w:p>
+      <w:pPr>
+        <w:spacing w:line="240" w:lineRule="auto"/>
+        <w:rPr>
+          <w:rFonts w:ascii="Times New Roman" w:eastAsia="Times New Roman" w:hAnsi="Times New Roman" w:cs="Times New Roman"/>
+          <w:sz w:val="24"/>
+          <w:szCs w:val="24"/>
+        </w:rPr>
+      </w:pPr>
+    </w:p>
+    <w:p>
+      <w:pPr>
+        <w:spacing w:line="240" w:lineRule="auto"/>
         <w:ind w:left="1200"/>
         <w:rPr>
           <w:rFonts w:ascii="Times New Roman" w:eastAsia="Times New Roman" w:hAnsi="Times New Roman" w:cs="Times New Roman"/>
@@ -5608,177 +5192,6 @@
           <w:rFonts w:ascii="Times New Roman" w:eastAsia="Times New Roman" w:hAnsi="Times New Roman" w:cs="Times New Roman"/>
           <w:sz w:val="20"/>
           <w:szCs w:val="20"/>
-        </w:rPr>
-      </w:pPr>
-    </w:p>
-    <w:p>
-      <w:pPr>
-        <w:spacing w:line="240" w:lineRule="auto"/>
-        <w:ind w:left="1200"/>
-        <w:rPr>
-          <w:rFonts w:ascii="Times New Roman" w:eastAsia="Times New Roman" w:hAnsi="Times New Roman" w:cs="Times New Roman"/>
-          <w:sz w:val="20"/>
-          <w:szCs w:val="20"/>
-        </w:rPr>
-      </w:pPr>
-    </w:p>
-    <w:p>
-      <w:pPr>
-        <w:spacing w:line="240" w:lineRule="auto"/>
-        <w:rPr>
-          <w:rFonts w:ascii="Times New Roman" w:eastAsia="Times New Roman" w:hAnsi="Times New Roman" w:cs="Times New Roman"/>
-          <w:sz w:val="24"/>
-          <w:szCs w:val="24"/>
-        </w:rPr>
-      </w:pPr>
-    </w:p>
-    <w:p>
-      <w:pPr>
-        <w:spacing w:line="240" w:lineRule="auto"/>
-        <w:rPr>
-          <w:rFonts w:ascii="Times New Roman" w:eastAsia="Times New Roman" w:hAnsi="Times New Roman" w:cs="Times New Roman"/>
-          <w:sz w:val="24"/>
-          <w:szCs w:val="24"/>
-        </w:rPr>
-      </w:pPr>
-    </w:p>
-    <w:p>
-      <w:pPr>
-        <w:spacing w:line="240" w:lineRule="auto"/>
-        <w:rPr>
-          <w:rFonts w:ascii="Times New Roman" w:eastAsia="Times New Roman" w:hAnsi="Times New Roman" w:cs="Times New Roman"/>
-          <w:sz w:val="24"/>
-          <w:szCs w:val="24"/>
-        </w:rPr>
-      </w:pPr>
-    </w:p>
-    <w:p>
-      <w:pPr>
-        <w:spacing w:line="240" w:lineRule="auto"/>
-        <w:rPr>
-          <w:rFonts w:ascii="Times New Roman" w:eastAsia="Times New Roman" w:hAnsi="Times New Roman" w:cs="Times New Roman"/>
-          <w:sz w:val="24"/>
-          <w:szCs w:val="24"/>
-        </w:rPr>
-      </w:pPr>
-    </w:p>
-    <w:p>
-      <w:pPr>
-        <w:spacing w:line="240" w:lineRule="auto"/>
-        <w:rPr>
-          <w:rFonts w:ascii="Times New Roman" w:eastAsia="Times New Roman" w:hAnsi="Times New Roman" w:cs="Times New Roman"/>
-          <w:sz w:val="24"/>
-          <w:szCs w:val="24"/>
-        </w:rPr>
-      </w:pPr>
-    </w:p>
-    <w:p>
-      <w:pPr>
-        <w:spacing w:line="240" w:lineRule="auto"/>
-        <w:rPr>
-          <w:rFonts w:ascii="Times New Roman" w:eastAsia="Times New Roman" w:hAnsi="Times New Roman" w:cs="Times New Roman"/>
-          <w:sz w:val="24"/>
-          <w:szCs w:val="24"/>
-        </w:rPr>
-      </w:pPr>
-    </w:p>
-    <w:p>
-      <w:pPr>
-        <w:spacing w:line="240" w:lineRule="auto"/>
-        <w:rPr>
-          <w:rFonts w:ascii="Times New Roman" w:eastAsia="Times New Roman" w:hAnsi="Times New Roman" w:cs="Times New Roman"/>
-          <w:sz w:val="24"/>
-          <w:szCs w:val="24"/>
-        </w:rPr>
-      </w:pPr>
-    </w:p>
-    <w:p>
-      <w:pPr>
-        <w:spacing w:line="240" w:lineRule="auto"/>
-        <w:rPr>
-          <w:rFonts w:ascii="Times New Roman" w:eastAsia="Times New Roman" w:hAnsi="Times New Roman" w:cs="Times New Roman"/>
-          <w:sz w:val="24"/>
-          <w:szCs w:val="24"/>
-        </w:rPr>
-      </w:pPr>
-    </w:p>
-    <w:p>
-      <w:pPr>
-        <w:spacing w:line="240" w:lineRule="auto"/>
-        <w:rPr>
-          <w:rFonts w:ascii="Times New Roman" w:eastAsia="Times New Roman" w:hAnsi="Times New Roman" w:cs="Times New Roman"/>
-          <w:sz w:val="24"/>
-          <w:szCs w:val="24"/>
-        </w:rPr>
-      </w:pPr>
-    </w:p>
-    <w:p>
-      <w:pPr>
-        <w:spacing w:line="240" w:lineRule="auto"/>
-        <w:rPr>
-          <w:rFonts w:ascii="Times New Roman" w:eastAsia="Times New Roman" w:hAnsi="Times New Roman" w:cs="Times New Roman"/>
-          <w:sz w:val="24"/>
-          <w:szCs w:val="24"/>
-        </w:rPr>
-      </w:pPr>
-    </w:p>
-    <w:p>
-      <w:pPr>
-        <w:spacing w:line="240" w:lineRule="auto"/>
-        <w:rPr>
-          <w:rFonts w:ascii="Times New Roman" w:eastAsia="Times New Roman" w:hAnsi="Times New Roman" w:cs="Times New Roman"/>
-          <w:sz w:val="24"/>
-          <w:szCs w:val="24"/>
-        </w:rPr>
-      </w:pPr>
-    </w:p>
-    <w:p>
-      <w:pPr>
-        <w:spacing w:line="240" w:lineRule="auto"/>
-        <w:rPr>
-          <w:rFonts w:ascii="Times New Roman" w:eastAsia="Times New Roman" w:hAnsi="Times New Roman" w:cs="Times New Roman"/>
-          <w:sz w:val="24"/>
-          <w:szCs w:val="24"/>
-        </w:rPr>
-      </w:pPr>
-    </w:p>
-    <w:p>
-      <w:pPr>
-        <w:spacing w:line="240" w:lineRule="auto"/>
-        <w:rPr>
-          <w:rFonts w:ascii="Times New Roman" w:eastAsia="Times New Roman" w:hAnsi="Times New Roman" w:cs="Times New Roman"/>
-          <w:sz w:val="24"/>
-          <w:szCs w:val="24"/>
-        </w:rPr>
-      </w:pPr>
-    </w:p>
-    <w:p>
-      <w:pPr>
-        <w:spacing w:line="240" w:lineRule="auto"/>
-        <w:rPr>
-          <w:rFonts w:ascii="Times New Roman" w:eastAsia="Times New Roman" w:hAnsi="Times New Roman" w:cs="Times New Roman"/>
-          <w:sz w:val="24"/>
-          <w:szCs w:val="24"/>
-        </w:rPr>
-      </w:pPr>
-    </w:p>
-    <w:p>
-      <w:pPr>
-        <w:spacing w:line="240" w:lineRule="auto"/>
-        <w:rPr>
-          <w:rFonts w:ascii="Times New Roman" w:eastAsia="Times New Roman" w:hAnsi="Times New Roman" w:cs="Times New Roman"/>
-          <w:sz w:val="24"/>
-          <w:szCs w:val="24"/>
-        </w:rPr>
-      </w:pPr>
-    </w:p>
-    <w:p>
-      <w:pPr>
-        <w:spacing w:line="240" w:lineRule="auto"/>
-        <w:rPr>
-          <w:rFonts w:ascii="Times New Roman" w:eastAsia="Times New Roman" w:hAnsi="Times New Roman" w:cs="Times New Roman"/>
-          <w:sz w:val="24"/>
-          <w:szCs w:val="24"/>
         </w:rPr>
       </w:pPr>
     </w:p>
@@ -5901,6 +5314,7 @@
                 <w:sz w:val="24"/>
                 <w:szCs w:val="24"/>
               </w:rPr>
+              <w:lastRenderedPageBreak/>
               <w:t>Historia de usuario</w:t>
             </w:r>
           </w:p>
@@ -6244,7 +5658,7 @@
                 <w:sz w:val="24"/>
                 <w:szCs w:val="24"/>
               </w:rPr>
-              <w:t>Despejar mi agenda para otros eventos que me aparecieron</w:t>
+              <w:t>Liberar el cupo y no generar inconvenientes al restaurante en caso de no poder asistir o por problema externos</w:t>
             </w:r>
           </w:p>
         </w:tc>
@@ -6637,16 +6051,14 @@
               </w:rPr>
               <w:t xml:space="preserve">5 </w:t>
             </w:r>
-            <w:proofErr w:type="gramStart"/>
-            <w:r>
-              <w:rPr>
-                <w:rFonts w:ascii="Times New Roman" w:eastAsia="Times New Roman" w:hAnsi="Times New Roman" w:cs="Times New Roman"/>
-                <w:sz w:val="24"/>
-                <w:szCs w:val="24"/>
-              </w:rPr>
-              <w:t>Horas</w:t>
-            </w:r>
-            <w:proofErr w:type="gramEnd"/>
+            <w:r>
+              <w:rPr>
+                <w:rFonts w:ascii="Times New Roman" w:eastAsia="Times New Roman" w:hAnsi="Times New Roman" w:cs="Times New Roman"/>
+                <w:sz w:val="24"/>
+                <w:szCs w:val="24"/>
+              </w:rPr>
+              <w:t>horas</w:t>
+            </w:r>
           </w:p>
         </w:tc>
       </w:tr>
@@ -6895,6 +6307,7 @@
                 <w:sz w:val="24"/>
                 <w:szCs w:val="24"/>
               </w:rPr>
+              <w:lastRenderedPageBreak/>
               <w:t>Historia de usuario</w:t>
             </w:r>
           </w:p>
@@ -7238,7 +6651,7 @@
                 <w:sz w:val="24"/>
                 <w:szCs w:val="24"/>
               </w:rPr>
-              <w:t>Acordarme y prepararme</w:t>
+              <w:t>Recordar una reservación pendiente</w:t>
             </w:r>
           </w:p>
         </w:tc>
@@ -7362,18 +6775,26 @@
                 <w:sz w:val="24"/>
                 <w:szCs w:val="24"/>
               </w:rPr>
-              <w:t xml:space="preserve">Notificación </w:t>
-            </w:r>
-            <w:proofErr w:type="spellStart"/>
-            <w:r>
-              <w:rPr>
-                <w:rFonts w:ascii="Times New Roman" w:eastAsia="Times New Roman" w:hAnsi="Times New Roman" w:cs="Times New Roman"/>
-                <w:sz w:val="24"/>
-                <w:szCs w:val="24"/>
-              </w:rPr>
-              <w:t>push</w:t>
-            </w:r>
-            <w:proofErr w:type="spellEnd"/>
+              <w:t>Notificación</w:t>
+            </w:r>
+            <w:r>
+              <w:rPr>
+                <w:rFonts w:ascii="Times New Roman" w:eastAsia="Times New Roman" w:hAnsi="Times New Roman" w:cs="Times New Roman"/>
+                <w:sz w:val="24"/>
+                <w:szCs w:val="24"/>
+              </w:rPr>
+              <w:t xml:space="preserve"> en la </w:t>
+            </w:r>
+            <w:proofErr w:type="gramStart"/>
+            <w:r>
+              <w:rPr>
+                <w:rFonts w:ascii="Times New Roman" w:eastAsia="Times New Roman" w:hAnsi="Times New Roman" w:cs="Times New Roman"/>
+                <w:sz w:val="24"/>
+                <w:szCs w:val="24"/>
+              </w:rPr>
+              <w:t>app</w:t>
+            </w:r>
+            <w:proofErr w:type="gramEnd"/>
             <w:r>
               <w:rPr>
                 <w:rFonts w:ascii="Times New Roman" w:eastAsia="Times New Roman" w:hAnsi="Times New Roman" w:cs="Times New Roman"/>
@@ -7605,16 +7026,14 @@
               </w:rPr>
               <w:t xml:space="preserve">2 </w:t>
             </w:r>
-            <w:proofErr w:type="spellStart"/>
-            <w:r>
-              <w:rPr>
-                <w:rFonts w:ascii="Times New Roman" w:eastAsia="Times New Roman" w:hAnsi="Times New Roman" w:cs="Times New Roman"/>
-                <w:sz w:val="24"/>
-                <w:szCs w:val="24"/>
-              </w:rPr>
-              <w:t>Dias</w:t>
-            </w:r>
-            <w:proofErr w:type="spellEnd"/>
+            <w:r>
+              <w:rPr>
+                <w:rFonts w:ascii="Times New Roman" w:eastAsia="Times New Roman" w:hAnsi="Times New Roman" w:cs="Times New Roman"/>
+                <w:sz w:val="24"/>
+                <w:szCs w:val="24"/>
+              </w:rPr>
+              <w:t>días</w:t>
+            </w:r>
           </w:p>
         </w:tc>
       </w:tr>
@@ -7781,106 +7200,6 @@
           <w:rFonts w:ascii="Times New Roman" w:eastAsia="Times New Roman" w:hAnsi="Times New Roman" w:cs="Times New Roman"/>
           <w:sz w:val="20"/>
           <w:szCs w:val="20"/>
-        </w:rPr>
-      </w:pPr>
-    </w:p>
-    <w:p>
-      <w:pPr>
-        <w:spacing w:line="240" w:lineRule="auto"/>
-        <w:rPr>
-          <w:rFonts w:ascii="Times New Roman" w:eastAsia="Times New Roman" w:hAnsi="Times New Roman" w:cs="Times New Roman"/>
-          <w:sz w:val="24"/>
-          <w:szCs w:val="24"/>
-        </w:rPr>
-      </w:pPr>
-    </w:p>
-    <w:p>
-      <w:pPr>
-        <w:spacing w:line="240" w:lineRule="auto"/>
-        <w:rPr>
-          <w:rFonts w:ascii="Times New Roman" w:eastAsia="Times New Roman" w:hAnsi="Times New Roman" w:cs="Times New Roman"/>
-          <w:sz w:val="24"/>
-          <w:szCs w:val="24"/>
-        </w:rPr>
-      </w:pPr>
-    </w:p>
-    <w:p>
-      <w:pPr>
-        <w:spacing w:line="240" w:lineRule="auto"/>
-        <w:rPr>
-          <w:rFonts w:ascii="Times New Roman" w:eastAsia="Times New Roman" w:hAnsi="Times New Roman" w:cs="Times New Roman"/>
-          <w:sz w:val="24"/>
-          <w:szCs w:val="24"/>
-        </w:rPr>
-      </w:pPr>
-    </w:p>
-    <w:p>
-      <w:pPr>
-        <w:spacing w:line="240" w:lineRule="auto"/>
-        <w:rPr>
-          <w:rFonts w:ascii="Times New Roman" w:eastAsia="Times New Roman" w:hAnsi="Times New Roman" w:cs="Times New Roman"/>
-          <w:sz w:val="24"/>
-          <w:szCs w:val="24"/>
-        </w:rPr>
-      </w:pPr>
-    </w:p>
-    <w:p>
-      <w:pPr>
-        <w:spacing w:line="240" w:lineRule="auto"/>
-        <w:rPr>
-          <w:rFonts w:ascii="Times New Roman" w:eastAsia="Times New Roman" w:hAnsi="Times New Roman" w:cs="Times New Roman"/>
-          <w:sz w:val="24"/>
-          <w:szCs w:val="24"/>
-        </w:rPr>
-      </w:pPr>
-    </w:p>
-    <w:p>
-      <w:pPr>
-        <w:spacing w:line="240" w:lineRule="auto"/>
-        <w:rPr>
-          <w:rFonts w:ascii="Times New Roman" w:eastAsia="Times New Roman" w:hAnsi="Times New Roman" w:cs="Times New Roman"/>
-          <w:sz w:val="24"/>
-          <w:szCs w:val="24"/>
-        </w:rPr>
-      </w:pPr>
-    </w:p>
-    <w:p>
-      <w:pPr>
-        <w:spacing w:line="240" w:lineRule="auto"/>
-        <w:rPr>
-          <w:rFonts w:ascii="Times New Roman" w:eastAsia="Times New Roman" w:hAnsi="Times New Roman" w:cs="Times New Roman"/>
-          <w:sz w:val="24"/>
-          <w:szCs w:val="24"/>
-        </w:rPr>
-      </w:pPr>
-    </w:p>
-    <w:p>
-      <w:pPr>
-        <w:spacing w:line="240" w:lineRule="auto"/>
-        <w:rPr>
-          <w:rFonts w:ascii="Times New Roman" w:eastAsia="Times New Roman" w:hAnsi="Times New Roman" w:cs="Times New Roman"/>
-          <w:sz w:val="24"/>
-          <w:szCs w:val="24"/>
-        </w:rPr>
-      </w:pPr>
-    </w:p>
-    <w:p>
-      <w:pPr>
-        <w:spacing w:line="240" w:lineRule="auto"/>
-        <w:rPr>
-          <w:rFonts w:ascii="Times New Roman" w:eastAsia="Times New Roman" w:hAnsi="Times New Roman" w:cs="Times New Roman"/>
-          <w:sz w:val="24"/>
-          <w:szCs w:val="24"/>
-        </w:rPr>
-      </w:pPr>
-    </w:p>
-    <w:p>
-      <w:pPr>
-        <w:spacing w:line="240" w:lineRule="auto"/>
-        <w:rPr>
-          <w:rFonts w:ascii="Times New Roman" w:eastAsia="Times New Roman" w:hAnsi="Times New Roman" w:cs="Times New Roman"/>
-          <w:sz w:val="24"/>
-          <w:szCs w:val="24"/>
         </w:rPr>
       </w:pPr>
     </w:p>
@@ -8033,6 +7352,7 @@
                 <w:sz w:val="24"/>
                 <w:szCs w:val="24"/>
               </w:rPr>
+              <w:lastRenderedPageBreak/>
               <w:t>Historia de usuario</w:t>
             </w:r>
           </w:p>
@@ -8376,7 +7696,23 @@
                 <w:sz w:val="24"/>
                 <w:szCs w:val="24"/>
               </w:rPr>
-              <w:t>actualizar mis datos y añadir una foto de perfil</w:t>
+              <w:t>A</w:t>
+            </w:r>
+            <w:r>
+              <w:rPr>
+                <w:rFonts w:ascii="Times New Roman" w:eastAsia="Times New Roman" w:hAnsi="Times New Roman" w:cs="Times New Roman"/>
+                <w:sz w:val="24"/>
+                <w:szCs w:val="24"/>
+              </w:rPr>
+              <w:t>ctualizar mis dato</w:t>
+            </w:r>
+            <w:r>
+              <w:rPr>
+                <w:rFonts w:ascii="Times New Roman" w:eastAsia="Times New Roman" w:hAnsi="Times New Roman" w:cs="Times New Roman"/>
+                <w:sz w:val="24"/>
+                <w:szCs w:val="24"/>
+              </w:rPr>
+              <w:t>s</w:t>
             </w:r>
           </w:p>
         </w:tc>
@@ -8478,7 +7814,7 @@
                 <w:sz w:val="24"/>
                 <w:szCs w:val="24"/>
               </w:rPr>
-              <w:t>Cambiar o actualizar información</w:t>
+              <w:t>Cambiar opcionalmente (Nombre, Foto o Contraseña)</w:t>
             </w:r>
           </w:p>
           <w:p>
@@ -8500,7 +7836,7 @@
                 <w:sz w:val="24"/>
                 <w:szCs w:val="24"/>
               </w:rPr>
-              <w:t>Cambiar o colocar foto de perfil</w:t>
+              <w:t>Guardar la información</w:t>
             </w:r>
           </w:p>
           <w:p>
@@ -8509,42 +7845,20 @@
                 <w:ilvl w:val="0"/>
                 <w:numId w:val="7"/>
               </w:numPr>
-              <w:spacing w:line="240" w:lineRule="auto"/>
-              <w:rPr>
-                <w:rFonts w:ascii="Times New Roman" w:eastAsia="Times New Roman" w:hAnsi="Times New Roman" w:cs="Times New Roman"/>
-                <w:sz w:val="24"/>
-                <w:szCs w:val="24"/>
-              </w:rPr>
-            </w:pPr>
-            <w:r>
-              <w:rPr>
-                <w:rFonts w:ascii="Times New Roman" w:eastAsia="Times New Roman" w:hAnsi="Times New Roman" w:cs="Times New Roman"/>
-                <w:sz w:val="24"/>
-                <w:szCs w:val="24"/>
-              </w:rPr>
-              <w:t>Cerrar sesión</w:t>
-            </w:r>
-          </w:p>
-          <w:p>
-            <w:pPr>
-              <w:numPr>
-                <w:ilvl w:val="0"/>
-                <w:numId w:val="7"/>
-              </w:numPr>
-              <w:spacing w:after="160" w:line="240" w:lineRule="auto"/>
-              <w:rPr>
-                <w:rFonts w:ascii="Times New Roman" w:eastAsia="Times New Roman" w:hAnsi="Times New Roman" w:cs="Times New Roman"/>
-                <w:sz w:val="24"/>
-                <w:szCs w:val="24"/>
-              </w:rPr>
-            </w:pPr>
-            <w:r>
-              <w:rPr>
-                <w:rFonts w:ascii="Times New Roman" w:eastAsia="Times New Roman" w:hAnsi="Times New Roman" w:cs="Times New Roman"/>
-                <w:sz w:val="24"/>
-                <w:szCs w:val="24"/>
-              </w:rPr>
-              <w:t>Guardar la información</w:t>
+              <w:spacing w:after="160" w:line="240" w:lineRule="auto"/>
+              <w:rPr>
+                <w:rFonts w:ascii="Times New Roman" w:eastAsia="Times New Roman" w:hAnsi="Times New Roman" w:cs="Times New Roman"/>
+                <w:sz w:val="24"/>
+                <w:szCs w:val="24"/>
+              </w:rPr>
+            </w:pPr>
+            <w:r>
+              <w:rPr>
+                <w:rFonts w:ascii="Times New Roman" w:eastAsia="Times New Roman" w:hAnsi="Times New Roman" w:cs="Times New Roman"/>
+                <w:sz w:val="24"/>
+                <w:szCs w:val="24"/>
+              </w:rPr>
+              <w:t>Actualizar información</w:t>
             </w:r>
           </w:p>
         </w:tc>
@@ -8769,16 +8083,14 @@
               </w:rPr>
               <w:t xml:space="preserve">5 </w:t>
             </w:r>
-            <w:proofErr w:type="spellStart"/>
-            <w:r>
-              <w:rPr>
-                <w:rFonts w:ascii="Times New Roman" w:eastAsia="Times New Roman" w:hAnsi="Times New Roman" w:cs="Times New Roman"/>
-                <w:sz w:val="24"/>
-                <w:szCs w:val="24"/>
-              </w:rPr>
-              <w:t>Dias</w:t>
-            </w:r>
-            <w:proofErr w:type="spellEnd"/>
+            <w:r>
+              <w:rPr>
+                <w:rFonts w:ascii="Times New Roman" w:eastAsia="Times New Roman" w:hAnsi="Times New Roman" w:cs="Times New Roman"/>
+                <w:sz w:val="24"/>
+                <w:szCs w:val="24"/>
+              </w:rPr>
+              <w:t>días</w:t>
+            </w:r>
           </w:p>
         </w:tc>
       </w:tr>
@@ -9037,104 +8349,6 @@
     <w:p>
       <w:pPr>
         <w:spacing w:line="240" w:lineRule="auto"/>
-        <w:rPr>
-          <w:rFonts w:ascii="Times New Roman" w:eastAsia="Times New Roman" w:hAnsi="Times New Roman" w:cs="Times New Roman"/>
-          <w:sz w:val="24"/>
-          <w:szCs w:val="24"/>
-        </w:rPr>
-      </w:pPr>
-    </w:p>
-    <w:p>
-      <w:pPr>
-        <w:spacing w:line="240" w:lineRule="auto"/>
-        <w:rPr>
-          <w:rFonts w:ascii="Times New Roman" w:eastAsia="Times New Roman" w:hAnsi="Times New Roman" w:cs="Times New Roman"/>
-          <w:sz w:val="24"/>
-          <w:szCs w:val="24"/>
-        </w:rPr>
-      </w:pPr>
-    </w:p>
-    <w:p>
-      <w:pPr>
-        <w:spacing w:line="240" w:lineRule="auto"/>
-        <w:ind w:left="1200"/>
-        <w:rPr>
-          <w:rFonts w:ascii="Times New Roman" w:eastAsia="Times New Roman" w:hAnsi="Times New Roman" w:cs="Times New Roman"/>
-          <w:sz w:val="24"/>
-          <w:szCs w:val="24"/>
-        </w:rPr>
-      </w:pPr>
-    </w:p>
-    <w:p>
-      <w:pPr>
-        <w:spacing w:line="240" w:lineRule="auto"/>
-        <w:ind w:left="1200"/>
-        <w:rPr>
-          <w:rFonts w:ascii="Times New Roman" w:eastAsia="Times New Roman" w:hAnsi="Times New Roman" w:cs="Times New Roman"/>
-          <w:sz w:val="20"/>
-          <w:szCs w:val="20"/>
-        </w:rPr>
-      </w:pPr>
-    </w:p>
-    <w:p>
-      <w:pPr>
-        <w:spacing w:line="240" w:lineRule="auto"/>
-        <w:ind w:left="1200"/>
-        <w:rPr>
-          <w:rFonts w:ascii="Times New Roman" w:eastAsia="Times New Roman" w:hAnsi="Times New Roman" w:cs="Times New Roman"/>
-          <w:sz w:val="20"/>
-          <w:szCs w:val="20"/>
-        </w:rPr>
-      </w:pPr>
-    </w:p>
-    <w:p>
-      <w:pPr>
-        <w:spacing w:line="240" w:lineRule="auto"/>
-        <w:ind w:left="1200"/>
-        <w:rPr>
-          <w:rFonts w:ascii="Times New Roman" w:eastAsia="Times New Roman" w:hAnsi="Times New Roman" w:cs="Times New Roman"/>
-          <w:sz w:val="20"/>
-          <w:szCs w:val="20"/>
-        </w:rPr>
-      </w:pPr>
-    </w:p>
-    <w:p>
-      <w:pPr>
-        <w:spacing w:line="240" w:lineRule="auto"/>
-        <w:ind w:left="1200"/>
-        <w:rPr>
-          <w:rFonts w:ascii="Times New Roman" w:eastAsia="Times New Roman" w:hAnsi="Times New Roman" w:cs="Times New Roman"/>
-          <w:sz w:val="20"/>
-          <w:szCs w:val="20"/>
-        </w:rPr>
-      </w:pPr>
-    </w:p>
-    <w:p>
-      <w:pPr>
-        <w:spacing w:line="240" w:lineRule="auto"/>
-        <w:ind w:left="1200"/>
-        <w:rPr>
-          <w:rFonts w:ascii="Times New Roman" w:eastAsia="Times New Roman" w:hAnsi="Times New Roman" w:cs="Times New Roman"/>
-          <w:sz w:val="20"/>
-          <w:szCs w:val="20"/>
-        </w:rPr>
-      </w:pPr>
-    </w:p>
-    <w:p>
-      <w:pPr>
-        <w:spacing w:line="240" w:lineRule="auto"/>
-        <w:ind w:left="1200"/>
-        <w:rPr>
-          <w:rFonts w:ascii="Times New Roman" w:eastAsia="Times New Roman" w:hAnsi="Times New Roman" w:cs="Times New Roman"/>
-          <w:sz w:val="20"/>
-          <w:szCs w:val="20"/>
-        </w:rPr>
-      </w:pPr>
-    </w:p>
-    <w:p>
-      <w:pPr>
-        <w:spacing w:line="240" w:lineRule="auto"/>
-        <w:ind w:left="1200"/>
         <w:rPr>
           <w:rFonts w:ascii="Times New Roman" w:eastAsia="Times New Roman" w:hAnsi="Times New Roman" w:cs="Times New Roman"/>
           <w:sz w:val="20"/>
@@ -9469,7 +8683,15 @@
                 <w:sz w:val="24"/>
                 <w:szCs w:val="24"/>
               </w:rPr>
-              <w:t xml:space="preserve">Ver los restaurantes que tengo en la zona </w:t>
+              <w:t>Ver los restaurante</w:t>
+            </w:r>
+            <w:r>
+              <w:rPr>
+                <w:rFonts w:ascii="Times New Roman" w:eastAsia="Times New Roman" w:hAnsi="Times New Roman" w:cs="Times New Roman"/>
+                <w:sz w:val="24"/>
+                <w:szCs w:val="24"/>
+              </w:rPr>
+              <w:t>s cercanos</w:t>
             </w:r>
           </w:p>
         </w:tc>
@@ -9546,7 +8768,23 @@
                 <w:sz w:val="24"/>
                 <w:szCs w:val="24"/>
               </w:rPr>
-              <w:t>Saber que restaurantes tengo cerca de mi ubicación</w:t>
+              <w:t xml:space="preserve">Saber que restaurantes tengo cerca de </w:t>
+            </w:r>
+            <w:r>
+              <w:rPr>
+                <w:rFonts w:ascii="Times New Roman" w:eastAsia="Times New Roman" w:hAnsi="Times New Roman" w:cs="Times New Roman"/>
+                <w:sz w:val="24"/>
+                <w:szCs w:val="24"/>
+              </w:rPr>
+              <w:t>a mi</w:t>
+            </w:r>
+            <w:r>
+              <w:rPr>
+                <w:rFonts w:ascii="Times New Roman" w:eastAsia="Times New Roman" w:hAnsi="Times New Roman" w:cs="Times New Roman"/>
+                <w:sz w:val="24"/>
+                <w:szCs w:val="24"/>
+              </w:rPr>
+              <w:t xml:space="preserve"> ubicación</w:t>
             </w:r>
           </w:p>
         </w:tc>
@@ -9670,7 +8908,45 @@
                 <w:sz w:val="24"/>
                 <w:szCs w:val="24"/>
               </w:rPr>
-              <w:t>Mostrar restaurantes y barra de búsqueda</w:t>
+              <w:t>Realizar una búsqueda de acuerdo con la ubicación</w:t>
+            </w:r>
+          </w:p>
+          <w:p>
+            <w:pPr>
+              <w:numPr>
+                <w:ilvl w:val="0"/>
+                <w:numId w:val="2"/>
+              </w:numPr>
+              <w:spacing w:line="240" w:lineRule="auto"/>
+              <w:rPr>
+                <w:rFonts w:ascii="Times New Roman" w:eastAsia="Times New Roman" w:hAnsi="Times New Roman" w:cs="Times New Roman"/>
+                <w:sz w:val="24"/>
+                <w:szCs w:val="24"/>
+              </w:rPr>
+            </w:pPr>
+            <w:r>
+              <w:rPr>
+                <w:rFonts w:ascii="Times New Roman" w:eastAsia="Times New Roman" w:hAnsi="Times New Roman" w:cs="Times New Roman"/>
+                <w:sz w:val="24"/>
+                <w:szCs w:val="24"/>
+              </w:rPr>
+              <w:t xml:space="preserve">Mostrar los restaurantes </w:t>
+            </w:r>
+            <w:r>
+              <w:rPr>
+                <w:rFonts w:ascii="Times New Roman" w:eastAsia="Times New Roman" w:hAnsi="Times New Roman" w:cs="Times New Roman"/>
+                <w:sz w:val="24"/>
+                <w:szCs w:val="24"/>
+              </w:rPr>
+              <w:t>más</w:t>
+            </w:r>
+            <w:r>
+              <w:rPr>
+                <w:rFonts w:ascii="Times New Roman" w:eastAsia="Times New Roman" w:hAnsi="Times New Roman" w:cs="Times New Roman"/>
+                <w:sz w:val="24"/>
+                <w:szCs w:val="24"/>
+              </w:rPr>
+              <w:t xml:space="preserve"> cercanos en la zona</w:t>
             </w:r>
           </w:p>
         </w:tc>
@@ -9893,18 +9169,8 @@
                 <w:sz w:val="24"/>
                 <w:szCs w:val="24"/>
               </w:rPr>
-              <w:t xml:space="preserve">2 </w:t>
-            </w:r>
-            <w:proofErr w:type="spellStart"/>
-            <w:r>
-              <w:rPr>
-                <w:rFonts w:ascii="Times New Roman" w:eastAsia="Times New Roman" w:hAnsi="Times New Roman" w:cs="Times New Roman"/>
-                <w:sz w:val="24"/>
-                <w:szCs w:val="24"/>
-              </w:rPr>
-              <w:t>Dias</w:t>
-            </w:r>
-            <w:proofErr w:type="spellEnd"/>
+              <w:t>2 Dias</w:t>
+            </w:r>
           </w:p>
         </w:tc>
       </w:tr>
@@ -10259,6 +9525,7 @@
                 <w:rFonts w:ascii="Times New Roman" w:eastAsia="Times New Roman" w:hAnsi="Times New Roman" w:cs="Times New Roman"/>
                 <w:sz w:val="24"/>
                 <w:szCs w:val="24"/>
+                <w:highlight w:val="red"/>
               </w:rPr>
             </w:pPr>
             <w:r>
@@ -10422,7 +9689,7 @@
                 <w:sz w:val="24"/>
                 <w:szCs w:val="24"/>
               </w:rPr>
-              <w:t>Separar los platillos del restaurante</w:t>
+              <w:t>poder seleccionar un platillo del menú,</w:t>
             </w:r>
           </w:p>
         </w:tc>
@@ -10499,7 +9766,7 @@
                 <w:sz w:val="24"/>
                 <w:szCs w:val="24"/>
               </w:rPr>
-              <w:t>Tenerlos listos a la hora que vaya a llegar a la reserva</w:t>
+              <w:t>elegir lo que deseo comer antes de hacer mi reserva.</w:t>
             </w:r>
           </w:p>
         </w:tc>
@@ -10579,7 +9846,31 @@
                 <w:sz w:val="24"/>
                 <w:szCs w:val="24"/>
               </w:rPr>
-              <w:t>Ver platos</w:t>
+              <w:t xml:space="preserve">Ver </w:t>
+            </w:r>
+            <w:r>
+              <w:rPr>
+                <w:rFonts w:ascii="Times New Roman" w:eastAsia="Times New Roman" w:hAnsi="Times New Roman" w:cs="Times New Roman"/>
+                <w:sz w:val="24"/>
+                <w:szCs w:val="24"/>
+              </w:rPr>
+              <w:t xml:space="preserve">los </w:t>
+            </w:r>
+            <w:r>
+              <w:rPr>
+                <w:rFonts w:ascii="Times New Roman" w:eastAsia="Times New Roman" w:hAnsi="Times New Roman" w:cs="Times New Roman"/>
+                <w:sz w:val="24"/>
+                <w:szCs w:val="24"/>
+              </w:rPr>
+              <w:t xml:space="preserve">platillos del </w:t>
+            </w:r>
+            <w:r>
+              <w:rPr>
+                <w:rFonts w:ascii="Times New Roman" w:eastAsia="Times New Roman" w:hAnsi="Times New Roman" w:cs="Times New Roman"/>
+                <w:sz w:val="24"/>
+                <w:szCs w:val="24"/>
+              </w:rPr>
+              <w:t>restaurante</w:t>
             </w:r>
           </w:p>
           <w:p>
@@ -10601,7 +9892,23 @@
                 <w:sz w:val="24"/>
                 <w:szCs w:val="24"/>
               </w:rPr>
-              <w:t>Seleccionar platos</w:t>
+              <w:t>Seleccionar pla</w:t>
+            </w:r>
+            <w:r>
+              <w:rPr>
+                <w:rFonts w:ascii="Times New Roman" w:eastAsia="Times New Roman" w:hAnsi="Times New Roman" w:cs="Times New Roman"/>
+                <w:sz w:val="24"/>
+                <w:szCs w:val="24"/>
+              </w:rPr>
+              <w:t>tillo</w:t>
+            </w:r>
+            <w:r>
+              <w:rPr>
+                <w:rFonts w:ascii="Times New Roman" w:eastAsia="Times New Roman" w:hAnsi="Times New Roman" w:cs="Times New Roman"/>
+                <w:sz w:val="24"/>
+                <w:szCs w:val="24"/>
+              </w:rPr>
+              <w:t>s</w:t>
             </w:r>
           </w:p>
           <w:p>
@@ -10610,28 +9917,50 @@
                 <w:ilvl w:val="0"/>
                 <w:numId w:val="3"/>
               </w:numPr>
-              <w:spacing w:after="160" w:line="240" w:lineRule="auto"/>
-              <w:rPr>
-                <w:rFonts w:ascii="Times New Roman" w:eastAsia="Times New Roman" w:hAnsi="Times New Roman" w:cs="Times New Roman"/>
-                <w:sz w:val="24"/>
-                <w:szCs w:val="24"/>
-              </w:rPr>
-            </w:pPr>
-            <w:r>
-              <w:rPr>
-                <w:rFonts w:ascii="Times New Roman" w:eastAsia="Times New Roman" w:hAnsi="Times New Roman" w:cs="Times New Roman"/>
-                <w:sz w:val="24"/>
-                <w:szCs w:val="24"/>
-              </w:rPr>
-              <w:t>Guardar</w:t>
-            </w:r>
-            <w:r>
-              <w:rPr>
-                <w:rFonts w:ascii="Times New Roman" w:eastAsia="Times New Roman" w:hAnsi="Times New Roman" w:cs="Times New Roman"/>
-                <w:sz w:val="24"/>
-                <w:szCs w:val="24"/>
-              </w:rPr>
-              <w:tab/>
+              <w:spacing w:line="240" w:lineRule="auto"/>
+              <w:rPr>
+                <w:rFonts w:ascii="Times New Roman" w:eastAsia="Times New Roman" w:hAnsi="Times New Roman" w:cs="Times New Roman"/>
+                <w:sz w:val="24"/>
+                <w:szCs w:val="24"/>
+              </w:rPr>
+            </w:pPr>
+            <w:r>
+              <w:rPr>
+                <w:rFonts w:ascii="Times New Roman" w:eastAsia="Times New Roman" w:hAnsi="Times New Roman" w:cs="Times New Roman"/>
+                <w:sz w:val="24"/>
+                <w:szCs w:val="24"/>
+              </w:rPr>
+              <w:t>Reservar platillos</w:t>
+            </w:r>
+          </w:p>
+          <w:p>
+            <w:pPr>
+              <w:numPr>
+                <w:ilvl w:val="0"/>
+                <w:numId w:val="3"/>
+              </w:numPr>
+              <w:spacing w:after="160" w:line="240" w:lineRule="auto"/>
+              <w:rPr>
+                <w:rFonts w:ascii="Times New Roman" w:eastAsia="Times New Roman" w:hAnsi="Times New Roman" w:cs="Times New Roman"/>
+                <w:sz w:val="24"/>
+                <w:szCs w:val="24"/>
+              </w:rPr>
+            </w:pPr>
+            <w:r>
+              <w:rPr>
+                <w:rFonts w:ascii="Times New Roman" w:eastAsia="Times New Roman" w:hAnsi="Times New Roman" w:cs="Times New Roman"/>
+                <w:sz w:val="24"/>
+                <w:szCs w:val="24"/>
+              </w:rPr>
+              <w:t>Guard</w:t>
+            </w:r>
+            <w:r>
+              <w:rPr>
+                <w:rFonts w:ascii="Times New Roman" w:eastAsia="Times New Roman" w:hAnsi="Times New Roman" w:cs="Times New Roman"/>
+                <w:sz w:val="24"/>
+                <w:szCs w:val="24"/>
+              </w:rPr>
+              <w:t>ar selección</w:t>
             </w:r>
           </w:p>
         </w:tc>
@@ -10856,16 +10185,14 @@
               </w:rPr>
               <w:t xml:space="preserve">10 </w:t>
             </w:r>
-            <w:proofErr w:type="gramStart"/>
-            <w:r>
-              <w:rPr>
-                <w:rFonts w:ascii="Times New Roman" w:eastAsia="Times New Roman" w:hAnsi="Times New Roman" w:cs="Times New Roman"/>
-                <w:sz w:val="24"/>
-                <w:szCs w:val="24"/>
-              </w:rPr>
-              <w:t>Horas</w:t>
-            </w:r>
-            <w:proofErr w:type="gramEnd"/>
+            <w:r>
+              <w:rPr>
+                <w:rFonts w:ascii="Times New Roman" w:eastAsia="Times New Roman" w:hAnsi="Times New Roman" w:cs="Times New Roman"/>
+                <w:sz w:val="24"/>
+                <w:szCs w:val="24"/>
+              </w:rPr>
+              <w:t>horas</w:t>
+            </w:r>
           </w:p>
         </w:tc>
       </w:tr>
@@ -11117,138 +10444,6 @@
           <w:rFonts w:ascii="Times New Roman" w:eastAsia="Times New Roman" w:hAnsi="Times New Roman" w:cs="Times New Roman"/>
           <w:sz w:val="24"/>
           <w:szCs w:val="24"/>
-        </w:rPr>
-      </w:pPr>
-    </w:p>
-    <w:p>
-      <w:pPr>
-        <w:spacing w:line="240" w:lineRule="auto"/>
-        <w:ind w:left="1200"/>
-        <w:rPr>
-          <w:rFonts w:ascii="Times New Roman" w:eastAsia="Times New Roman" w:hAnsi="Times New Roman" w:cs="Times New Roman"/>
-          <w:sz w:val="20"/>
-          <w:szCs w:val="20"/>
-        </w:rPr>
-      </w:pPr>
-    </w:p>
-    <w:p>
-      <w:pPr>
-        <w:spacing w:line="240" w:lineRule="auto"/>
-        <w:ind w:left="1200"/>
-        <w:rPr>
-          <w:rFonts w:ascii="Times New Roman" w:eastAsia="Times New Roman" w:hAnsi="Times New Roman" w:cs="Times New Roman"/>
-          <w:sz w:val="20"/>
-          <w:szCs w:val="20"/>
-        </w:rPr>
-      </w:pPr>
-    </w:p>
-    <w:p>
-      <w:pPr>
-        <w:spacing w:line="240" w:lineRule="auto"/>
-        <w:ind w:left="1200"/>
-        <w:rPr>
-          <w:rFonts w:ascii="Times New Roman" w:eastAsia="Times New Roman" w:hAnsi="Times New Roman" w:cs="Times New Roman"/>
-          <w:sz w:val="20"/>
-          <w:szCs w:val="20"/>
-        </w:rPr>
-      </w:pPr>
-    </w:p>
-    <w:p>
-      <w:pPr>
-        <w:spacing w:line="240" w:lineRule="auto"/>
-        <w:ind w:left="1200"/>
-        <w:rPr>
-          <w:rFonts w:ascii="Times New Roman" w:eastAsia="Times New Roman" w:hAnsi="Times New Roman" w:cs="Times New Roman"/>
-          <w:sz w:val="20"/>
-          <w:szCs w:val="20"/>
-        </w:rPr>
-      </w:pPr>
-    </w:p>
-    <w:p>
-      <w:pPr>
-        <w:spacing w:line="240" w:lineRule="auto"/>
-        <w:ind w:left="1200"/>
-        <w:rPr>
-          <w:rFonts w:ascii="Times New Roman" w:eastAsia="Times New Roman" w:hAnsi="Times New Roman" w:cs="Times New Roman"/>
-          <w:sz w:val="20"/>
-          <w:szCs w:val="20"/>
-        </w:rPr>
-      </w:pPr>
-    </w:p>
-    <w:p>
-      <w:pPr>
-        <w:spacing w:line="240" w:lineRule="auto"/>
-        <w:ind w:left="1200"/>
-        <w:rPr>
-          <w:rFonts w:ascii="Times New Roman" w:eastAsia="Times New Roman" w:hAnsi="Times New Roman" w:cs="Times New Roman"/>
-          <w:sz w:val="20"/>
-          <w:szCs w:val="20"/>
-        </w:rPr>
-      </w:pPr>
-    </w:p>
-    <w:p>
-      <w:pPr>
-        <w:spacing w:line="240" w:lineRule="auto"/>
-        <w:ind w:left="1200"/>
-        <w:rPr>
-          <w:rFonts w:ascii="Times New Roman" w:eastAsia="Times New Roman" w:hAnsi="Times New Roman" w:cs="Times New Roman"/>
-          <w:sz w:val="20"/>
-          <w:szCs w:val="20"/>
-        </w:rPr>
-      </w:pPr>
-    </w:p>
-    <w:p>
-      <w:pPr>
-        <w:spacing w:line="240" w:lineRule="auto"/>
-        <w:ind w:left="1200"/>
-        <w:rPr>
-          <w:rFonts w:ascii="Times New Roman" w:eastAsia="Times New Roman" w:hAnsi="Times New Roman" w:cs="Times New Roman"/>
-          <w:sz w:val="20"/>
-          <w:szCs w:val="20"/>
-        </w:rPr>
-      </w:pPr>
-    </w:p>
-    <w:p>
-      <w:pPr>
-        <w:spacing w:line="240" w:lineRule="auto"/>
-        <w:ind w:left="1200"/>
-        <w:rPr>
-          <w:rFonts w:ascii="Times New Roman" w:eastAsia="Times New Roman" w:hAnsi="Times New Roman" w:cs="Times New Roman"/>
-          <w:sz w:val="20"/>
-          <w:szCs w:val="20"/>
-        </w:rPr>
-      </w:pPr>
-    </w:p>
-    <w:p>
-      <w:pPr>
-        <w:spacing w:line="240" w:lineRule="auto"/>
-        <w:ind w:left="1200"/>
-        <w:rPr>
-          <w:rFonts w:ascii="Times New Roman" w:eastAsia="Times New Roman" w:hAnsi="Times New Roman" w:cs="Times New Roman"/>
-          <w:sz w:val="20"/>
-          <w:szCs w:val="20"/>
-        </w:rPr>
-      </w:pPr>
-    </w:p>
-    <w:p>
-      <w:pPr>
-        <w:spacing w:line="240" w:lineRule="auto"/>
-        <w:ind w:left="1200"/>
-        <w:rPr>
-          <w:rFonts w:ascii="Times New Roman" w:eastAsia="Times New Roman" w:hAnsi="Times New Roman" w:cs="Times New Roman"/>
-          <w:sz w:val="20"/>
-          <w:szCs w:val="20"/>
-        </w:rPr>
-      </w:pPr>
-    </w:p>
-    <w:p>
-      <w:pPr>
-        <w:spacing w:line="240" w:lineRule="auto"/>
-        <w:ind w:left="1200"/>
-        <w:rPr>
-          <w:rFonts w:ascii="Times New Roman" w:eastAsia="Times New Roman" w:hAnsi="Times New Roman" w:cs="Times New Roman"/>
-          <w:sz w:val="20"/>
-          <w:szCs w:val="20"/>
         </w:rPr>
       </w:pPr>
     </w:p>
@@ -11443,7 +10638,15 @@
                 <w:sz w:val="24"/>
                 <w:szCs w:val="24"/>
               </w:rPr>
-              <w:t>Cambiar platillos</w:t>
+              <w:t>Modificar</w:t>
+            </w:r>
+            <w:r>
+              <w:rPr>
+                <w:rFonts w:ascii="Times New Roman" w:eastAsia="Times New Roman" w:hAnsi="Times New Roman" w:cs="Times New Roman"/>
+                <w:sz w:val="24"/>
+                <w:szCs w:val="24"/>
+              </w:rPr>
+              <w:t xml:space="preserve"> platillos</w:t>
             </w:r>
           </w:p>
         </w:tc>
@@ -11598,7 +10801,23 @@
                 <w:sz w:val="24"/>
                 <w:szCs w:val="24"/>
               </w:rPr>
-              <w:t xml:space="preserve">Cambiar el platillo </w:t>
+              <w:t xml:space="preserve">Modificar </w:t>
+            </w:r>
+            <w:r>
+              <w:rPr>
+                <w:rFonts w:ascii="Times New Roman" w:eastAsia="Times New Roman" w:hAnsi="Times New Roman" w:cs="Times New Roman"/>
+                <w:sz w:val="24"/>
+                <w:szCs w:val="24"/>
+              </w:rPr>
+              <w:t xml:space="preserve">el platillo </w:t>
+            </w:r>
+            <w:r>
+              <w:rPr>
+                <w:rFonts w:ascii="Times New Roman" w:eastAsia="Times New Roman" w:hAnsi="Times New Roman" w:cs="Times New Roman"/>
+                <w:sz w:val="24"/>
+                <w:szCs w:val="24"/>
+              </w:rPr>
+              <w:t>de mi reserva</w:t>
             </w:r>
           </w:p>
         </w:tc>
@@ -11675,7 +10894,7 @@
                 <w:sz w:val="24"/>
                 <w:szCs w:val="24"/>
               </w:rPr>
-              <w:t xml:space="preserve">Hacer un cambio por si se me antojo algo más </w:t>
+              <w:t>Ajustar los platillos de mi reserva según mis gustos</w:t>
             </w:r>
           </w:p>
         </w:tc>
@@ -11755,7 +10974,23 @@
                 <w:sz w:val="24"/>
                 <w:szCs w:val="24"/>
               </w:rPr>
-              <w:t>Tener platos seleccionados.</w:t>
+              <w:t>Tener plat</w:t>
+            </w:r>
+            <w:r>
+              <w:rPr>
+                <w:rFonts w:ascii="Times New Roman" w:eastAsia="Times New Roman" w:hAnsi="Times New Roman" w:cs="Times New Roman"/>
+                <w:sz w:val="24"/>
+                <w:szCs w:val="24"/>
+              </w:rPr>
+              <w:t>illos</w:t>
+            </w:r>
+            <w:r>
+              <w:rPr>
+                <w:rFonts w:ascii="Times New Roman" w:eastAsia="Times New Roman" w:hAnsi="Times New Roman" w:cs="Times New Roman"/>
+                <w:sz w:val="24"/>
+                <w:szCs w:val="24"/>
+              </w:rPr>
+              <w:t xml:space="preserve"> seleccionados.</w:t>
             </w:r>
           </w:p>
           <w:p>
@@ -11778,7 +11013,7 @@
                 <w:sz w:val="24"/>
                 <w:szCs w:val="24"/>
               </w:rPr>
-              <w:t xml:space="preserve">Ver menú. </w:t>
+              <w:t>Ver menú</w:t>
             </w:r>
           </w:p>
           <w:p>
@@ -11800,7 +11035,23 @@
                 <w:sz w:val="24"/>
                 <w:szCs w:val="24"/>
               </w:rPr>
-              <w:t>Seleccionar platos nuevos.</w:t>
+              <w:t>Seleccionar plat</w:t>
+            </w:r>
+            <w:r>
+              <w:rPr>
+                <w:rFonts w:ascii="Times New Roman" w:eastAsia="Times New Roman" w:hAnsi="Times New Roman" w:cs="Times New Roman"/>
+                <w:sz w:val="24"/>
+                <w:szCs w:val="24"/>
+              </w:rPr>
+              <w:t>illo</w:t>
+            </w:r>
+            <w:r>
+              <w:rPr>
+                <w:rFonts w:ascii="Times New Roman" w:eastAsia="Times New Roman" w:hAnsi="Times New Roman" w:cs="Times New Roman"/>
+                <w:sz w:val="24"/>
+                <w:szCs w:val="24"/>
+              </w:rPr>
+              <w:t>s nuevos.</w:t>
             </w:r>
           </w:p>
           <w:p>
@@ -11822,7 +11073,23 @@
                 <w:sz w:val="24"/>
                 <w:szCs w:val="24"/>
               </w:rPr>
-              <w:t>Cambiar platos</w:t>
+              <w:t>Cambiar plat</w:t>
+            </w:r>
+            <w:r>
+              <w:rPr>
+                <w:rFonts w:ascii="Times New Roman" w:eastAsia="Times New Roman" w:hAnsi="Times New Roman" w:cs="Times New Roman"/>
+                <w:sz w:val="24"/>
+                <w:szCs w:val="24"/>
+              </w:rPr>
+              <w:t>ill</w:t>
+            </w:r>
+            <w:r>
+              <w:rPr>
+                <w:rFonts w:ascii="Times New Roman" w:eastAsia="Times New Roman" w:hAnsi="Times New Roman" w:cs="Times New Roman"/>
+                <w:sz w:val="24"/>
+                <w:szCs w:val="24"/>
+              </w:rPr>
+              <w:t>os</w:t>
             </w:r>
           </w:p>
           <w:p>
@@ -12069,16 +11336,14 @@
               </w:rPr>
               <w:t xml:space="preserve">15 </w:t>
             </w:r>
-            <w:proofErr w:type="gramStart"/>
-            <w:r>
-              <w:rPr>
-                <w:rFonts w:ascii="Times New Roman" w:eastAsia="Times New Roman" w:hAnsi="Times New Roman" w:cs="Times New Roman"/>
-                <w:sz w:val="24"/>
-                <w:szCs w:val="24"/>
-              </w:rPr>
-              <w:t>Horas</w:t>
-            </w:r>
-            <w:proofErr w:type="gramEnd"/>
+            <w:r>
+              <w:rPr>
+                <w:rFonts w:ascii="Times New Roman" w:eastAsia="Times New Roman" w:hAnsi="Times New Roman" w:cs="Times New Roman"/>
+                <w:sz w:val="24"/>
+                <w:szCs w:val="24"/>
+              </w:rPr>
+              <w:t>horas</w:t>
+            </w:r>
           </w:p>
         </w:tc>
       </w:tr>
@@ -12321,193 +11586,30 @@
           <w:szCs w:val="24"/>
         </w:rPr>
       </w:pPr>
-    </w:p>
-    <w:p>
-      <w:pPr>
-        <w:spacing w:line="240" w:lineRule="auto"/>
-        <w:ind w:left="1200"/>
-        <w:rPr>
-          <w:rFonts w:ascii="Times New Roman" w:eastAsia="Times New Roman" w:hAnsi="Times New Roman" w:cs="Times New Roman"/>
-          <w:sz w:val="24"/>
-          <w:szCs w:val="24"/>
-        </w:rPr>
-      </w:pPr>
-    </w:p>
-    <w:p>
-      <w:pPr>
-        <w:spacing w:line="240" w:lineRule="auto"/>
-        <w:ind w:left="1200"/>
-        <w:rPr>
-          <w:rFonts w:ascii="Times New Roman" w:eastAsia="Times New Roman" w:hAnsi="Times New Roman" w:cs="Times New Roman"/>
-          <w:sz w:val="20"/>
-          <w:szCs w:val="20"/>
-        </w:rPr>
-      </w:pPr>
       <w:bookmarkStart w:id="36" w:name="_a7izul30yapk" w:colFirst="0" w:colLast="0"/>
+      <w:bookmarkStart w:id="37" w:name="_1rumdrh4a7ti" w:colFirst="0" w:colLast="0"/>
+      <w:bookmarkStart w:id="38" w:name="_q24ggjm9238g" w:colFirst="0" w:colLast="0"/>
+      <w:bookmarkStart w:id="39" w:name="_4bizyzugpuud" w:colFirst="0" w:colLast="0"/>
+      <w:bookmarkStart w:id="40" w:name="_z95wo5t63g7d" w:colFirst="0" w:colLast="0"/>
+      <w:bookmarkStart w:id="41" w:name="_ss9jloh3vot6" w:colFirst="0" w:colLast="0"/>
+      <w:bookmarkStart w:id="42" w:name="_wqu5dzd9rc3c" w:colFirst="0" w:colLast="0"/>
+      <w:bookmarkStart w:id="43" w:name="_w9xffaejtj51" w:colFirst="0" w:colLast="0"/>
+      <w:bookmarkStart w:id="44" w:name="_hnz80ntaymt" w:colFirst="0" w:colLast="0"/>
+      <w:bookmarkStart w:id="45" w:name="_mjsuj9nurkfm" w:colFirst="0" w:colLast="0"/>
+      <w:bookmarkStart w:id="46" w:name="_1bpw9r84c784" w:colFirst="0" w:colLast="0"/>
+      <w:bookmarkStart w:id="47" w:name="_kmlun2tny0p8" w:colFirst="0" w:colLast="0"/>
       <w:bookmarkEnd w:id="36"/>
-    </w:p>
-    <w:p>
-      <w:pPr>
-        <w:spacing w:line="240" w:lineRule="auto"/>
-        <w:ind w:left="1200"/>
-        <w:rPr>
-          <w:rFonts w:ascii="Times New Roman" w:eastAsia="Times New Roman" w:hAnsi="Times New Roman" w:cs="Times New Roman"/>
-          <w:sz w:val="20"/>
-          <w:szCs w:val="20"/>
-        </w:rPr>
-      </w:pPr>
-      <w:bookmarkStart w:id="37" w:name="_1rumdrh4a7ti" w:colFirst="0" w:colLast="0"/>
       <w:bookmarkEnd w:id="37"/>
-    </w:p>
-    <w:p>
-      <w:pPr>
-        <w:spacing w:line="240" w:lineRule="auto"/>
-        <w:ind w:left="1200"/>
-        <w:rPr>
-          <w:rFonts w:ascii="Times New Roman" w:eastAsia="Times New Roman" w:hAnsi="Times New Roman" w:cs="Times New Roman"/>
-          <w:sz w:val="20"/>
-          <w:szCs w:val="20"/>
-        </w:rPr>
-      </w:pPr>
-      <w:bookmarkStart w:id="38" w:name="_q24ggjm9238g" w:colFirst="0" w:colLast="0"/>
       <w:bookmarkEnd w:id="38"/>
-    </w:p>
-    <w:p>
-      <w:pPr>
-        <w:spacing w:line="240" w:lineRule="auto"/>
-        <w:ind w:left="1200"/>
-        <w:rPr>
-          <w:rFonts w:ascii="Times New Roman" w:eastAsia="Times New Roman" w:hAnsi="Times New Roman" w:cs="Times New Roman"/>
-          <w:sz w:val="20"/>
-          <w:szCs w:val="20"/>
-        </w:rPr>
-      </w:pPr>
-      <w:bookmarkStart w:id="39" w:name="_4bizyzugpuud" w:colFirst="0" w:colLast="0"/>
       <w:bookmarkEnd w:id="39"/>
-    </w:p>
-    <w:p>
-      <w:pPr>
-        <w:spacing w:line="240" w:lineRule="auto"/>
-        <w:ind w:left="1200"/>
-        <w:rPr>
-          <w:rFonts w:ascii="Times New Roman" w:eastAsia="Times New Roman" w:hAnsi="Times New Roman" w:cs="Times New Roman"/>
-          <w:sz w:val="20"/>
-          <w:szCs w:val="20"/>
-        </w:rPr>
-      </w:pPr>
-      <w:bookmarkStart w:id="40" w:name="_z95wo5t63g7d" w:colFirst="0" w:colLast="0"/>
       <w:bookmarkEnd w:id="40"/>
-    </w:p>
-    <w:p>
-      <w:pPr>
-        <w:spacing w:line="240" w:lineRule="auto"/>
-        <w:ind w:left="1200"/>
-        <w:rPr>
-          <w:rFonts w:ascii="Times New Roman" w:eastAsia="Times New Roman" w:hAnsi="Times New Roman" w:cs="Times New Roman"/>
-          <w:sz w:val="20"/>
-          <w:szCs w:val="20"/>
-        </w:rPr>
-      </w:pPr>
-      <w:bookmarkStart w:id="41" w:name="_ss9jloh3vot6" w:colFirst="0" w:colLast="0"/>
       <w:bookmarkEnd w:id="41"/>
-    </w:p>
-    <w:p>
-      <w:pPr>
-        <w:spacing w:line="240" w:lineRule="auto"/>
-        <w:ind w:left="1200"/>
-        <w:rPr>
-          <w:rFonts w:ascii="Times New Roman" w:eastAsia="Times New Roman" w:hAnsi="Times New Roman" w:cs="Times New Roman"/>
-          <w:sz w:val="20"/>
-          <w:szCs w:val="20"/>
-        </w:rPr>
-      </w:pPr>
-      <w:bookmarkStart w:id="42" w:name="_wqu5dzd9rc3c" w:colFirst="0" w:colLast="0"/>
       <w:bookmarkEnd w:id="42"/>
-    </w:p>
-    <w:p>
-      <w:pPr>
-        <w:spacing w:line="240" w:lineRule="auto"/>
-        <w:ind w:left="1200"/>
-        <w:rPr>
-          <w:rFonts w:ascii="Times New Roman" w:eastAsia="Times New Roman" w:hAnsi="Times New Roman" w:cs="Times New Roman"/>
-          <w:sz w:val="20"/>
-          <w:szCs w:val="20"/>
-        </w:rPr>
-      </w:pPr>
-      <w:bookmarkStart w:id="43" w:name="_w9xffaejtj51" w:colFirst="0" w:colLast="0"/>
       <w:bookmarkEnd w:id="43"/>
-    </w:p>
-    <w:p>
-      <w:pPr>
-        <w:spacing w:line="240" w:lineRule="auto"/>
-        <w:ind w:left="1200"/>
-        <w:rPr>
-          <w:rFonts w:ascii="Times New Roman" w:eastAsia="Times New Roman" w:hAnsi="Times New Roman" w:cs="Times New Roman"/>
-          <w:sz w:val="20"/>
-          <w:szCs w:val="20"/>
-        </w:rPr>
-      </w:pPr>
-      <w:bookmarkStart w:id="44" w:name="_hnz80ntaymt" w:colFirst="0" w:colLast="0"/>
       <w:bookmarkEnd w:id="44"/>
-    </w:p>
-    <w:p>
-      <w:pPr>
-        <w:spacing w:line="240" w:lineRule="auto"/>
-        <w:ind w:left="1200"/>
-        <w:rPr>
-          <w:rFonts w:ascii="Times New Roman" w:eastAsia="Times New Roman" w:hAnsi="Times New Roman" w:cs="Times New Roman"/>
-          <w:sz w:val="20"/>
-          <w:szCs w:val="20"/>
-        </w:rPr>
-      </w:pPr>
-      <w:bookmarkStart w:id="45" w:name="_mjsuj9nurkfm" w:colFirst="0" w:colLast="0"/>
       <w:bookmarkEnd w:id="45"/>
-    </w:p>
-    <w:p>
-      <w:pPr>
-        <w:spacing w:line="240" w:lineRule="auto"/>
-        <w:ind w:left="1200"/>
-        <w:rPr>
-          <w:rFonts w:ascii="Times New Roman" w:eastAsia="Times New Roman" w:hAnsi="Times New Roman" w:cs="Times New Roman"/>
-          <w:sz w:val="20"/>
-          <w:szCs w:val="20"/>
-        </w:rPr>
-      </w:pPr>
-      <w:bookmarkStart w:id="46" w:name="_1bpw9r84c784" w:colFirst="0" w:colLast="0"/>
       <w:bookmarkEnd w:id="46"/>
-    </w:p>
-    <w:p>
-      <w:pPr>
-        <w:spacing w:line="240" w:lineRule="auto"/>
-        <w:ind w:left="1200"/>
-        <w:rPr>
-          <w:rFonts w:ascii="Times New Roman" w:eastAsia="Times New Roman" w:hAnsi="Times New Roman" w:cs="Times New Roman"/>
-          <w:sz w:val="20"/>
-          <w:szCs w:val="20"/>
-        </w:rPr>
-      </w:pPr>
-      <w:bookmarkStart w:id="47" w:name="_kmlun2tny0p8" w:colFirst="0" w:colLast="0"/>
       <w:bookmarkEnd w:id="47"/>
-    </w:p>
-    <w:p>
-      <w:pPr>
-        <w:spacing w:line="240" w:lineRule="auto"/>
-        <w:rPr>
-          <w:rFonts w:ascii="Times New Roman" w:eastAsia="Times New Roman" w:hAnsi="Times New Roman" w:cs="Times New Roman"/>
-          <w:sz w:val="24"/>
-          <w:szCs w:val="24"/>
-        </w:rPr>
-      </w:pPr>
-    </w:p>
-    <w:p>
-      <w:pPr>
-        <w:spacing w:line="240" w:lineRule="auto"/>
-        <w:rPr>
-          <w:rFonts w:ascii="Times New Roman" w:eastAsia="Times New Roman" w:hAnsi="Times New Roman" w:cs="Times New Roman"/>
-          <w:sz w:val="24"/>
-          <w:szCs w:val="24"/>
-        </w:rPr>
-      </w:pPr>
     </w:p>
     <w:p>
       <w:pPr>
@@ -12569,7 +11671,6 @@
                 <w:sz w:val="24"/>
                 <w:szCs w:val="24"/>
               </w:rPr>
-              <w:lastRenderedPageBreak/>
               <w:t>Historia de usuario</w:t>
             </w:r>
           </w:p>
@@ -12913,7 +12014,23 @@
                 <w:sz w:val="24"/>
                 <w:szCs w:val="24"/>
               </w:rPr>
-              <w:t>Cancelar platos que ya no interesan o ya no me apetecen</w:t>
+              <w:t>Cancelar plat</w:t>
+            </w:r>
+            <w:r>
+              <w:rPr>
+                <w:rFonts w:ascii="Times New Roman" w:eastAsia="Times New Roman" w:hAnsi="Times New Roman" w:cs="Times New Roman"/>
+                <w:sz w:val="24"/>
+                <w:szCs w:val="24"/>
+              </w:rPr>
+              <w:t>ill</w:t>
+            </w:r>
+            <w:r>
+              <w:rPr>
+                <w:rFonts w:ascii="Times New Roman" w:eastAsia="Times New Roman" w:hAnsi="Times New Roman" w:cs="Times New Roman"/>
+                <w:sz w:val="24"/>
+                <w:szCs w:val="24"/>
+              </w:rPr>
+              <w:t>os que ya no interesan o ya no me apetecen</w:t>
             </w:r>
           </w:p>
         </w:tc>
@@ -12974,6 +12091,50 @@
               <w:right w:w="70" w:type="dxa"/>
             </w:tcMar>
           </w:tcPr>
+          <w:p>
+            <w:pPr>
+              <w:numPr>
+                <w:ilvl w:val="0"/>
+                <w:numId w:val="9"/>
+              </w:numPr>
+              <w:spacing w:line="240" w:lineRule="auto"/>
+              <w:rPr>
+                <w:rFonts w:ascii="Times New Roman" w:eastAsia="Times New Roman" w:hAnsi="Times New Roman" w:cs="Times New Roman"/>
+                <w:sz w:val="24"/>
+                <w:szCs w:val="24"/>
+              </w:rPr>
+            </w:pPr>
+            <w:r>
+              <w:rPr>
+                <w:rFonts w:ascii="Times New Roman" w:eastAsia="Times New Roman" w:hAnsi="Times New Roman" w:cs="Times New Roman"/>
+                <w:sz w:val="24"/>
+                <w:szCs w:val="24"/>
+              </w:rPr>
+              <w:t>Tener platillos seleccionados</w:t>
+            </w:r>
+          </w:p>
+          <w:p>
+            <w:pPr>
+              <w:numPr>
+                <w:ilvl w:val="0"/>
+                <w:numId w:val="9"/>
+              </w:numPr>
+              <w:spacing w:line="240" w:lineRule="auto"/>
+              <w:rPr>
+                <w:rFonts w:ascii="Times New Roman" w:eastAsia="Times New Roman" w:hAnsi="Times New Roman" w:cs="Times New Roman"/>
+                <w:sz w:val="24"/>
+                <w:szCs w:val="24"/>
+              </w:rPr>
+            </w:pPr>
+            <w:r>
+              <w:rPr>
+                <w:rFonts w:ascii="Times New Roman" w:eastAsia="Times New Roman" w:hAnsi="Times New Roman" w:cs="Times New Roman"/>
+                <w:sz w:val="24"/>
+                <w:szCs w:val="24"/>
+              </w:rPr>
+              <w:t>Ver reserva</w:t>
+            </w:r>
+          </w:p>
           <w:p>
             <w:pPr>
               <w:numPr>
@@ -14454,6 +13615,7 @@
     <w:p>
       <w:pPr>
         <w:spacing w:line="240" w:lineRule="auto"/>
+        <w:jc w:val="center"/>
         <w:rPr>
           <w:rFonts w:ascii="Times New Roman" w:eastAsia="Times New Roman" w:hAnsi="Times New Roman" w:cs="Times New Roman"/>
           <w:sz w:val="24"/>
@@ -14464,148 +13626,20 @@
     <w:p>
       <w:pPr>
         <w:spacing w:line="240" w:lineRule="auto"/>
+        <w:jc w:val="center"/>
         <w:rPr>
           <w:rFonts w:ascii="Times New Roman" w:eastAsia="Times New Roman" w:hAnsi="Times New Roman" w:cs="Times New Roman"/>
           <w:sz w:val="24"/>
           <w:szCs w:val="24"/>
         </w:rPr>
       </w:pPr>
-    </w:p>
-    <w:p>
-      <w:pPr>
-        <w:spacing w:line="240" w:lineRule="auto"/>
-        <w:jc w:val="center"/>
+      <w:r>
         <w:rPr>
           <w:rFonts w:ascii="Times New Roman" w:eastAsia="Times New Roman" w:hAnsi="Times New Roman" w:cs="Times New Roman"/>
           <w:sz w:val="24"/>
           <w:szCs w:val="24"/>
         </w:rPr>
-      </w:pPr>
-    </w:p>
-    <w:p>
-      <w:pPr>
-        <w:spacing w:line="240" w:lineRule="auto"/>
-        <w:jc w:val="center"/>
-        <w:rPr>
-          <w:rFonts w:ascii="Times New Roman" w:eastAsia="Times New Roman" w:hAnsi="Times New Roman" w:cs="Times New Roman"/>
-          <w:sz w:val="24"/>
-          <w:szCs w:val="24"/>
-        </w:rPr>
-      </w:pPr>
-    </w:p>
-    <w:p>
-      <w:pPr>
-        <w:spacing w:line="240" w:lineRule="auto"/>
-        <w:jc w:val="center"/>
-        <w:rPr>
-          <w:rFonts w:ascii="Times New Roman" w:eastAsia="Times New Roman" w:hAnsi="Times New Roman" w:cs="Times New Roman"/>
-          <w:sz w:val="24"/>
-          <w:szCs w:val="24"/>
-        </w:rPr>
-      </w:pPr>
-    </w:p>
-    <w:p>
-      <w:pPr>
-        <w:spacing w:line="240" w:lineRule="auto"/>
-        <w:jc w:val="center"/>
-        <w:rPr>
-          <w:rFonts w:ascii="Times New Roman" w:eastAsia="Times New Roman" w:hAnsi="Times New Roman" w:cs="Times New Roman"/>
-          <w:sz w:val="24"/>
-          <w:szCs w:val="24"/>
-        </w:rPr>
-      </w:pPr>
-    </w:p>
-    <w:p>
-      <w:pPr>
-        <w:spacing w:line="240" w:lineRule="auto"/>
-        <w:jc w:val="center"/>
-        <w:rPr>
-          <w:rFonts w:ascii="Times New Roman" w:eastAsia="Times New Roman" w:hAnsi="Times New Roman" w:cs="Times New Roman"/>
-          <w:sz w:val="24"/>
-          <w:szCs w:val="24"/>
-        </w:rPr>
-      </w:pPr>
-    </w:p>
-    <w:p>
-      <w:pPr>
-        <w:spacing w:line="240" w:lineRule="auto"/>
-        <w:jc w:val="center"/>
-        <w:rPr>
-          <w:rFonts w:ascii="Times New Roman" w:eastAsia="Times New Roman" w:hAnsi="Times New Roman" w:cs="Times New Roman"/>
-          <w:sz w:val="24"/>
-          <w:szCs w:val="24"/>
-        </w:rPr>
-      </w:pPr>
-    </w:p>
-    <w:p>
-      <w:pPr>
-        <w:spacing w:line="240" w:lineRule="auto"/>
-        <w:jc w:val="center"/>
-        <w:rPr>
-          <w:rFonts w:ascii="Times New Roman" w:eastAsia="Times New Roman" w:hAnsi="Times New Roman" w:cs="Times New Roman"/>
-          <w:sz w:val="24"/>
-          <w:szCs w:val="24"/>
-        </w:rPr>
-      </w:pPr>
-    </w:p>
-    <w:p>
-      <w:pPr>
-        <w:spacing w:line="240" w:lineRule="auto"/>
-        <w:rPr>
-          <w:rFonts w:ascii="Times New Roman" w:eastAsia="Times New Roman" w:hAnsi="Times New Roman" w:cs="Times New Roman"/>
-          <w:sz w:val="24"/>
-          <w:szCs w:val="24"/>
-        </w:rPr>
-      </w:pPr>
-    </w:p>
-    <w:p>
-      <w:pPr>
-        <w:spacing w:line="240" w:lineRule="auto"/>
-        <w:rPr>
-          <w:rFonts w:ascii="Times New Roman" w:eastAsia="Times New Roman" w:hAnsi="Times New Roman" w:cs="Times New Roman"/>
-          <w:sz w:val="24"/>
-          <w:szCs w:val="24"/>
-        </w:rPr>
-      </w:pPr>
-    </w:p>
-    <w:p>
-      <w:pPr>
-        <w:spacing w:line="240" w:lineRule="auto"/>
-        <w:jc w:val="center"/>
-        <w:rPr>
-          <w:rFonts w:ascii="Times New Roman" w:eastAsia="Times New Roman" w:hAnsi="Times New Roman" w:cs="Times New Roman"/>
-          <w:sz w:val="24"/>
-          <w:szCs w:val="24"/>
-        </w:rPr>
-      </w:pPr>
-    </w:p>
-    <w:p>
-      <w:pPr>
-        <w:spacing w:line="240" w:lineRule="auto"/>
-        <w:jc w:val="center"/>
-        <w:rPr>
-          <w:rFonts w:ascii="Times New Roman" w:eastAsia="Times New Roman" w:hAnsi="Times New Roman" w:cs="Times New Roman"/>
-          <w:sz w:val="24"/>
-          <w:szCs w:val="24"/>
-        </w:rPr>
-      </w:pPr>
-    </w:p>
-    <w:p>
-      <w:pPr>
-        <w:spacing w:line="240" w:lineRule="auto"/>
-        <w:jc w:val="center"/>
-        <w:rPr>
-          <w:rFonts w:ascii="Times New Roman" w:eastAsia="Times New Roman" w:hAnsi="Times New Roman" w:cs="Times New Roman"/>
-          <w:sz w:val="24"/>
-          <w:szCs w:val="24"/>
-        </w:rPr>
-      </w:pPr>
-      <w:r>
-        <w:rPr>
-          <w:rFonts w:ascii="Times New Roman" w:eastAsia="Times New Roman" w:hAnsi="Times New Roman" w:cs="Times New Roman"/>
-          <w:sz w:val="24"/>
-          <w:szCs w:val="24"/>
-        </w:rPr>
+        <w:lastRenderedPageBreak/>
         <w:t>ADMINISTRADORES (RESTAURANTE)</w:t>
       </w:r>
     </w:p>
@@ -15606,7 +14640,6 @@
                 <w:sz w:val="24"/>
                 <w:szCs w:val="24"/>
               </w:rPr>
-              <w:lastRenderedPageBreak/>
               <w:t>Nombre del requerimiento: </w:t>
             </w:r>
           </w:p>
@@ -15915,6 +14948,7 @@
                 <w:sz w:val="24"/>
                 <w:szCs w:val="24"/>
               </w:rPr>
+              <w:lastRenderedPageBreak/>
               <w:t>Criterios de aceptación:</w:t>
             </w:r>
           </w:p>
@@ -16802,7 +15836,6 @@
                 <w:sz w:val="24"/>
                 <w:szCs w:val="24"/>
               </w:rPr>
-              <w:lastRenderedPageBreak/>
               <w:t>Para poder:</w:t>
             </w:r>
           </w:p>
@@ -17112,6 +16145,7 @@
                 <w:sz w:val="24"/>
                 <w:szCs w:val="24"/>
               </w:rPr>
+              <w:lastRenderedPageBreak/>
               <w:t>Prioridad:</w:t>
             </w:r>
           </w:p>
@@ -17796,7 +16830,6 @@
                 <w:sz w:val="24"/>
                 <w:szCs w:val="24"/>
               </w:rPr>
-              <w:lastRenderedPageBreak/>
               <w:t>Para poder:</w:t>
             </w:r>
           </w:p>
@@ -18145,6 +17178,7 @@
                 <w:sz w:val="24"/>
                 <w:szCs w:val="24"/>
               </w:rPr>
+              <w:lastRenderedPageBreak/>
               <w:t>Estimación:</w:t>
             </w:r>
           </w:p>
@@ -18791,7 +17825,6 @@
                 <w:sz w:val="24"/>
                 <w:szCs w:val="24"/>
               </w:rPr>
-              <w:lastRenderedPageBreak/>
               <w:t>Para poder:</w:t>
             </w:r>
           </w:p>
@@ -20461,6 +19494,7 @@
                 <w:sz w:val="24"/>
                 <w:szCs w:val="24"/>
               </w:rPr>
+              <w:lastRenderedPageBreak/>
               <w:t>Criterios de aceptación:</w:t>
             </w:r>
           </w:p>
@@ -21286,7 +20320,6 @@
                 <w:sz w:val="24"/>
                 <w:szCs w:val="24"/>
               </w:rPr>
-              <w:lastRenderedPageBreak/>
               <w:t>Criterios de aceptación:</w:t>
             </w:r>
           </w:p>
@@ -21710,6 +20743,7 @@
                 <w:sz w:val="24"/>
                 <w:szCs w:val="24"/>
               </w:rPr>
+              <w:lastRenderedPageBreak/>
               <w:t>Historia de usuario</w:t>
             </w:r>
           </w:p>
@@ -22861,6 +21895,7 @@
                 <w:sz w:val="24"/>
                 <w:szCs w:val="24"/>
               </w:rPr>
+              <w:lastRenderedPageBreak/>
               <w:t>Como:</w:t>
             </w:r>
           </w:p>
@@ -23635,7 +22670,6 @@
                 <w:sz w:val="24"/>
                 <w:szCs w:val="24"/>
               </w:rPr>
-              <w:lastRenderedPageBreak/>
               <w:t>Como:</w:t>
             </w:r>
           </w:p>
@@ -24032,6 +23066,7 @@
                 <w:sz w:val="24"/>
                 <w:szCs w:val="24"/>
               </w:rPr>
+              <w:lastRenderedPageBreak/>
               <w:t>Prioridad:</w:t>
             </w:r>
           </w:p>
@@ -24853,7 +23888,6 @@
                 <w:sz w:val="24"/>
                 <w:szCs w:val="24"/>
               </w:rPr>
-              <w:lastRenderedPageBreak/>
               <w:t>Estimación:</w:t>
             </w:r>
           </w:p>
@@ -25365,6 +24399,7 @@
                 <w:sz w:val="24"/>
                 <w:szCs w:val="24"/>
               </w:rPr>
+              <w:lastRenderedPageBreak/>
               <w:t>Criterios de aceptación:</w:t>
             </w:r>
           </w:p>
@@ -26108,7 +25143,6 @@
                 <w:sz w:val="24"/>
                 <w:szCs w:val="24"/>
               </w:rPr>
-              <w:lastRenderedPageBreak/>
               <w:t>Criterios de aceptación:</w:t>
             </w:r>
           </w:p>
@@ -26630,6 +25664,7 @@
                 <w:sz w:val="24"/>
                 <w:szCs w:val="24"/>
               </w:rPr>
+              <w:lastRenderedPageBreak/>
               <w:t>Como:</w:t>
             </w:r>
           </w:p>
@@ -27280,7 +26315,6 @@
                 <w:sz w:val="24"/>
                 <w:szCs w:val="24"/>
               </w:rPr>
-              <w:lastRenderedPageBreak/>
               <w:t>Historia de usuario</w:t>
             </w:r>
           </w:p>
@@ -27763,6 +26797,14 @@
                 <w:szCs w:val="24"/>
               </w:rPr>
               <w:br/>
+            </w:r>
+            <w:r>
+              <w:rPr>
+                <w:rFonts w:ascii="Times New Roman" w:eastAsia="Times New Roman" w:hAnsi="Times New Roman" w:cs="Times New Roman"/>
+                <w:sz w:val="24"/>
+                <w:szCs w:val="24"/>
+              </w:rPr>
+              <w:lastRenderedPageBreak/>
               <w:t>-Posibilidad de filtrar o buscar reservas específicas (opcional).</w:t>
             </w:r>
           </w:p>
@@ -27805,6 +26847,7 @@
                 <w:sz w:val="24"/>
                 <w:szCs w:val="24"/>
               </w:rPr>
+              <w:lastRenderedPageBreak/>
               <w:t>Valor:</w:t>
             </w:r>
           </w:p>
@@ -30978,7 +30021,6 @@
   <w:style w:type="character" w:default="1" w:styleId="Fuentedeprrafopredeter">
     <w:name w:val="Default Paragraph Font"/>
     <w:uiPriority w:val="1"/>
-    <w:semiHidden/>
     <w:unhideWhenUsed/>
   </w:style>
   <w:style w:type="table" w:default="1" w:styleId="Tablanormal">

</xml_diff>